<commit_message>
Date: 29 Aug 2025
</commit_message>
<xml_diff>
--- a/Assignments.docx
+++ b/Assignments.docx
@@ -2688,11 +2688,382 @@
           <w:numId w:val="4"/>
         </w:numPr>
         <w:rPr>
-          <w:lang w:val="en-US"/>
-        </w:rPr>
-      </w:pPr>
-      <w:bookmarkStart w:id="0" w:name="_GoBack"/>
-      <w:bookmarkEnd w:id="0"/>
+          <w:sz w:val="24"/>
+          <w:szCs w:val="24"/>
+          <w:lang w:val="en-US"/>
+        </w:rPr>
+      </w:pPr>
+      <w:r>
+        <w:rPr>
+          <w:sz w:val="24"/>
+          <w:szCs w:val="24"/>
+          <w:lang w:val="en-US"/>
+        </w:rPr>
+        <w:lastRenderedPageBreak/>
+        <w:t xml:space="preserve">Launch </w:t>
+      </w:r>
+      <w:hyperlink r:id="rId20" w:history="1">
+        <w:r>
+          <w:rPr>
+            <w:rStyle w:val="Hyperlink"/>
+            <w:sz w:val="24"/>
+            <w:szCs w:val="24"/>
+            <w:lang w:val="en-US"/>
+          </w:rPr>
+          <w:t>https://testautomationpractice.blogspot.com/?m=1</w:t>
+        </w:r>
+      </w:hyperlink>
+    </w:p>
+    <w:p>
+      <w:pPr>
+        <w:pStyle w:val="ListParagraph"/>
+        <w:numPr>
+          <w:ilvl w:val="1"/>
+          <w:numId w:val="4"/>
+        </w:numPr>
+        <w:rPr>
+          <w:sz w:val="24"/>
+          <w:szCs w:val="24"/>
+          <w:lang w:val="en-US"/>
+        </w:rPr>
+      </w:pPr>
+      <w:r>
+        <w:rPr>
+          <w:sz w:val="24"/>
+          <w:szCs w:val="24"/>
+          <w:lang w:val="en-US"/>
+        </w:rPr>
+        <w:t>Enter Name</w:t>
+      </w:r>
+    </w:p>
+    <w:p>
+      <w:pPr>
+        <w:pStyle w:val="ListParagraph"/>
+        <w:numPr>
+          <w:ilvl w:val="1"/>
+          <w:numId w:val="4"/>
+        </w:numPr>
+        <w:rPr>
+          <w:sz w:val="24"/>
+          <w:szCs w:val="24"/>
+          <w:lang w:val="en-US"/>
+        </w:rPr>
+      </w:pPr>
+      <w:r>
+        <w:rPr>
+          <w:sz w:val="24"/>
+          <w:szCs w:val="24"/>
+          <w:lang w:val="en-US"/>
+        </w:rPr>
+        <w:t>Enter Email</w:t>
+      </w:r>
+    </w:p>
+    <w:p>
+      <w:pPr>
+        <w:pStyle w:val="ListParagraph"/>
+        <w:numPr>
+          <w:ilvl w:val="1"/>
+          <w:numId w:val="4"/>
+        </w:numPr>
+        <w:rPr>
+          <w:sz w:val="24"/>
+          <w:szCs w:val="24"/>
+          <w:lang w:val="en-US"/>
+        </w:rPr>
+      </w:pPr>
+      <w:r>
+        <w:rPr>
+          <w:sz w:val="24"/>
+          <w:szCs w:val="24"/>
+          <w:lang w:val="en-US"/>
+        </w:rPr>
+        <w:t>Enter Phone no</w:t>
+      </w:r>
+    </w:p>
+    <w:p>
+      <w:pPr>
+        <w:pStyle w:val="ListParagraph"/>
+        <w:numPr>
+          <w:ilvl w:val="1"/>
+          <w:numId w:val="4"/>
+        </w:numPr>
+        <w:rPr>
+          <w:sz w:val="24"/>
+          <w:szCs w:val="24"/>
+          <w:lang w:val="en-US"/>
+        </w:rPr>
+      </w:pPr>
+      <w:r>
+        <w:rPr>
+          <w:sz w:val="24"/>
+          <w:szCs w:val="24"/>
+          <w:lang w:val="en-US"/>
+        </w:rPr>
+        <w:t>Enter Address</w:t>
+      </w:r>
+    </w:p>
+    <w:p>
+      <w:pPr>
+        <w:pStyle w:val="ListParagraph"/>
+        <w:numPr>
+          <w:ilvl w:val="1"/>
+          <w:numId w:val="4"/>
+        </w:numPr>
+        <w:rPr>
+          <w:sz w:val="24"/>
+          <w:szCs w:val="24"/>
+          <w:lang w:val="en-US"/>
+        </w:rPr>
+      </w:pPr>
+      <w:r>
+        <w:rPr>
+          <w:sz w:val="24"/>
+          <w:szCs w:val="24"/>
+          <w:lang w:val="en-US"/>
+        </w:rPr>
+        <w:t>Select Gender</w:t>
+      </w:r>
+    </w:p>
+    <w:p>
+      <w:pPr>
+        <w:pStyle w:val="ListParagraph"/>
+        <w:numPr>
+          <w:ilvl w:val="1"/>
+          <w:numId w:val="4"/>
+        </w:numPr>
+        <w:rPr>
+          <w:sz w:val="24"/>
+          <w:szCs w:val="24"/>
+          <w:lang w:val="en-US"/>
+        </w:rPr>
+      </w:pPr>
+      <w:r>
+        <w:rPr>
+          <w:sz w:val="24"/>
+          <w:szCs w:val="24"/>
+          <w:lang w:val="en-US"/>
+        </w:rPr>
+        <w:t>Select the day on your birthdate</w:t>
+      </w:r>
+    </w:p>
+    <w:p>
+      <w:pPr>
+        <w:pStyle w:val="ListParagraph"/>
+        <w:numPr>
+          <w:ilvl w:val="1"/>
+          <w:numId w:val="4"/>
+        </w:numPr>
+        <w:rPr>
+          <w:sz w:val="24"/>
+          <w:szCs w:val="24"/>
+          <w:lang w:val="en-US"/>
+        </w:rPr>
+      </w:pPr>
+      <w:r>
+        <w:rPr>
+          <w:sz w:val="24"/>
+          <w:szCs w:val="24"/>
+          <w:lang w:val="en-US"/>
+        </w:rPr>
+        <w:t>Select your desired country</w:t>
+      </w:r>
+    </w:p>
+    <w:p>
+      <w:pPr>
+        <w:pStyle w:val="ListParagraph"/>
+        <w:numPr>
+          <w:ilvl w:val="1"/>
+          <w:numId w:val="4"/>
+        </w:numPr>
+        <w:rPr>
+          <w:sz w:val="24"/>
+          <w:szCs w:val="24"/>
+          <w:lang w:val="en-US"/>
+        </w:rPr>
+      </w:pPr>
+      <w:r>
+        <w:rPr>
+          <w:sz w:val="24"/>
+          <w:szCs w:val="24"/>
+          <w:lang w:val="en-US"/>
+        </w:rPr>
+        <w:t>Select any two / three color with your choice</w:t>
+      </w:r>
+    </w:p>
+    <w:p>
+      <w:pPr>
+        <w:pStyle w:val="ListParagraph"/>
+        <w:numPr>
+          <w:ilvl w:val="1"/>
+          <w:numId w:val="4"/>
+        </w:numPr>
+        <w:rPr>
+          <w:sz w:val="24"/>
+          <w:szCs w:val="24"/>
+          <w:lang w:val="en-US"/>
+        </w:rPr>
+      </w:pPr>
+      <w:r>
+        <w:rPr>
+          <w:sz w:val="24"/>
+          <w:szCs w:val="24"/>
+          <w:lang w:val="en-US"/>
+        </w:rPr>
+        <w:t>Select any two / three animals</w:t>
+      </w:r>
+    </w:p>
+    <w:p>
+      <w:pPr>
+        <w:pStyle w:val="ListParagraph"/>
+        <w:numPr>
+          <w:ilvl w:val="0"/>
+          <w:numId w:val="4"/>
+        </w:numPr>
+        <w:rPr>
+          <w:sz w:val="24"/>
+          <w:szCs w:val="24"/>
+          <w:lang w:val="en-US"/>
+        </w:rPr>
+      </w:pPr>
+      <w:r>
+        <w:rPr>
+          <w:sz w:val="24"/>
+          <w:szCs w:val="24"/>
+          <w:lang w:val="en-US"/>
+        </w:rPr>
+        <w:t xml:space="preserve">Open </w:t>
+      </w:r>
+      <w:hyperlink r:id="rId21" w:history="1">
+        <w:r>
+          <w:rPr>
+            <w:rStyle w:val="Hyperlink"/>
+            <w:sz w:val="24"/>
+            <w:szCs w:val="24"/>
+            <w:lang w:val="en-US"/>
+          </w:rPr>
+          <w:t>https://dash.bling</w:t>
+        </w:r>
+        <w:bookmarkStart w:id="0" w:name="_GoBack"/>
+        <w:bookmarkEnd w:id="0"/>
+        <w:r>
+          <w:rPr>
+            <w:rStyle w:val="Hyperlink"/>
+            <w:sz w:val="24"/>
+            <w:szCs w:val="24"/>
+            <w:lang w:val="en-US"/>
+          </w:rPr>
+          <w:t>-</w:t>
+        </w:r>
+        <w:r>
+          <w:rPr>
+            <w:rStyle w:val="Hyperlink"/>
+            <w:sz w:val="24"/>
+            <w:szCs w:val="24"/>
+            <w:lang w:val="en-US"/>
+          </w:rPr>
+          <w:t>center.com/platform/signIn.html</w:t>
+        </w:r>
+      </w:hyperlink>
+    </w:p>
+    <w:p>
+      <w:pPr>
+        <w:pStyle w:val="ListParagraph"/>
+        <w:numPr>
+          <w:ilvl w:val="1"/>
+          <w:numId w:val="4"/>
+        </w:numPr>
+        <w:rPr>
+          <w:sz w:val="24"/>
+          <w:szCs w:val="24"/>
+          <w:lang w:val="en-US"/>
+        </w:rPr>
+      </w:pPr>
+      <w:r>
+        <w:rPr>
+          <w:sz w:val="24"/>
+          <w:szCs w:val="24"/>
+          <w:lang w:val="en-US"/>
+        </w:rPr>
+        <w:t>Click on forgot password</w:t>
+      </w:r>
+    </w:p>
+    <w:p>
+      <w:pPr>
+        <w:pStyle w:val="ListParagraph"/>
+        <w:numPr>
+          <w:ilvl w:val="1"/>
+          <w:numId w:val="4"/>
+        </w:numPr>
+        <w:rPr>
+          <w:sz w:val="24"/>
+          <w:szCs w:val="24"/>
+          <w:lang w:val="en-US"/>
+        </w:rPr>
+      </w:pPr>
+      <w:r>
+        <w:rPr>
+          <w:sz w:val="24"/>
+          <w:szCs w:val="24"/>
+          <w:lang w:val="en-US"/>
+        </w:rPr>
+        <w:t>Enter your email id</w:t>
+      </w:r>
+    </w:p>
+    <w:p>
+      <w:pPr>
+        <w:pStyle w:val="ListParagraph"/>
+        <w:numPr>
+          <w:ilvl w:val="1"/>
+          <w:numId w:val="4"/>
+        </w:numPr>
+        <w:rPr>
+          <w:sz w:val="24"/>
+          <w:szCs w:val="24"/>
+          <w:lang w:val="en-US"/>
+        </w:rPr>
+      </w:pPr>
+      <w:r>
+        <w:rPr>
+          <w:sz w:val="24"/>
+          <w:szCs w:val="24"/>
+          <w:lang w:val="en-US"/>
+        </w:rPr>
+        <w:t>Click on reset password button</w:t>
+      </w:r>
+    </w:p>
+    <w:p>
+      <w:pPr>
+        <w:pStyle w:val="ListParagraph"/>
+        <w:numPr>
+          <w:ilvl w:val="1"/>
+          <w:numId w:val="4"/>
+        </w:numPr>
+        <w:rPr>
+          <w:sz w:val="24"/>
+          <w:szCs w:val="24"/>
+          <w:lang w:val="en-US"/>
+        </w:rPr>
+      </w:pPr>
+      <w:r>
+        <w:rPr>
+          <w:sz w:val="24"/>
+          <w:szCs w:val="24"/>
+          <w:lang w:val="en-US"/>
+        </w:rPr>
+        <w:t>Display the text (message) in green color.</w:t>
+      </w:r>
+    </w:p>
+    <w:p>
+      <w:pPr>
+        <w:pStyle w:val="ListParagraph"/>
+        <w:numPr>
+          <w:ilvl w:val="0"/>
+          <w:numId w:val="4"/>
+        </w:numPr>
+        <w:rPr>
+          <w:lang w:val="en-US"/>
+        </w:rPr>
+      </w:pPr>
     </w:p>
     <w:sectPr>
       <w:pgSz w:w="11906" w:h="16838"/>
@@ -3614,6 +3985,18 @@
       <w:u w:val="single"/>
     </w:rPr>
   </w:style>
+  <w:style w:type="character" w:styleId="FollowedHyperlink">
+    <w:name w:val="FollowedHyperlink"/>
+    <w:basedOn w:val="DefaultParagraphFont"/>
+    <w:uiPriority w:val="99"/>
+    <w:semiHidden/>
+    <w:unhideWhenUsed/>
+    <w:rsid w:val="002C1AB5"/>
+    <w:rPr>
+      <w:color w:val="954F72" w:themeColor="followedHyperlink"/>
+      <w:u w:val="single"/>
+    </w:rPr>
+  </w:style>
 </w:styles>
 </file>
 

</xml_diff>

<commit_message>
Date: 01 Sept 2025
</commit_message>
<xml_diff>
--- a/Assignments.docx
+++ b/Assignments.docx
@@ -2841,12 +2841,549 @@
           <w:ilvl w:val="0"/>
           <w:numId w:val="4"/>
         </w:numPr>
-        <w:rPr>
+        <w:spacing w:line="254" w:lineRule="auto"/>
+        <w:rPr>
+          <w:sz w:val="24"/>
+          <w:szCs w:val="24"/>
+          <w:lang w:val="en-US"/>
+        </w:rPr>
+      </w:pPr>
+      <w:r>
+        <w:rPr>
+          <w:sz w:val="24"/>
+          <w:szCs w:val="24"/>
+          <w:lang w:val="en-US"/>
+        </w:rPr>
+        <w:t xml:space="preserve">Open </w:t>
+      </w:r>
+      <w:hyperlink r:id="rId22" w:history="1">
+        <w:r>
+          <w:rPr>
+            <w:rStyle w:val="Hyperlink"/>
+            <w:sz w:val="24"/>
+            <w:szCs w:val="24"/>
+            <w:lang w:val="en-US"/>
+          </w:rPr>
+          <w:t>https://www.rediff.com/</w:t>
+        </w:r>
+      </w:hyperlink>
+      <w:r>
+        <w:rPr>
+          <w:sz w:val="24"/>
+          <w:szCs w:val="24"/>
+          <w:lang w:val="en-US"/>
+        </w:rPr>
+        <w:t xml:space="preserve"> </w:t>
+      </w:r>
+    </w:p>
+    <w:p>
+      <w:pPr>
+        <w:pStyle w:val="ListParagraph"/>
+        <w:numPr>
+          <w:ilvl w:val="1"/>
+          <w:numId w:val="4"/>
+        </w:numPr>
+        <w:spacing w:line="254" w:lineRule="auto"/>
+        <w:rPr>
+          <w:sz w:val="24"/>
+          <w:szCs w:val="24"/>
+          <w:lang w:val="en-US"/>
+        </w:rPr>
+      </w:pPr>
+      <w:r>
+        <w:rPr>
+          <w:sz w:val="24"/>
+          <w:szCs w:val="24"/>
+          <w:lang w:val="en-US"/>
+        </w:rPr>
+        <w:t>Click on Money</w:t>
+      </w:r>
+    </w:p>
+    <w:p>
+      <w:pPr>
+        <w:pStyle w:val="ListParagraph"/>
+        <w:numPr>
+          <w:ilvl w:val="1"/>
+          <w:numId w:val="4"/>
+        </w:numPr>
+        <w:spacing w:line="254" w:lineRule="auto"/>
+        <w:rPr>
+          <w:sz w:val="24"/>
+          <w:szCs w:val="24"/>
+          <w:lang w:val="en-US"/>
+        </w:rPr>
+      </w:pPr>
+      <w:r>
+        <w:rPr>
+          <w:sz w:val="24"/>
+          <w:szCs w:val="24"/>
+          <w:lang w:val="en-US"/>
+        </w:rPr>
+        <w:t>Click on More Gainers</w:t>
+      </w:r>
+    </w:p>
+    <w:p>
+      <w:pPr>
+        <w:pStyle w:val="ListParagraph"/>
+        <w:numPr>
+          <w:ilvl w:val="1"/>
+          <w:numId w:val="4"/>
+        </w:numPr>
+        <w:spacing w:line="254" w:lineRule="auto"/>
+        <w:rPr>
+          <w:sz w:val="24"/>
+          <w:szCs w:val="24"/>
+          <w:lang w:val="en-US"/>
+        </w:rPr>
+      </w:pPr>
+      <w:r>
+        <w:rPr>
+          <w:sz w:val="24"/>
+          <w:szCs w:val="24"/>
+          <w:lang w:val="en-US"/>
+        </w:rPr>
+        <w:t>Display title of all the headers</w:t>
+      </w:r>
+    </w:p>
+    <w:p>
+      <w:pPr>
+        <w:pStyle w:val="ListParagraph"/>
+        <w:numPr>
+          <w:ilvl w:val="1"/>
+          <w:numId w:val="4"/>
+        </w:numPr>
+        <w:spacing w:line="254" w:lineRule="auto"/>
+        <w:rPr>
+          <w:sz w:val="24"/>
+          <w:szCs w:val="24"/>
+          <w:lang w:val="en-US"/>
+        </w:rPr>
+      </w:pPr>
+      <w:r>
+        <w:rPr>
+          <w:sz w:val="24"/>
+          <w:szCs w:val="24"/>
+          <w:lang w:val="en-US"/>
+        </w:rPr>
+        <w:t>Display total no of rows</w:t>
+      </w:r>
+    </w:p>
+    <w:p>
+      <w:pPr>
+        <w:pStyle w:val="ListParagraph"/>
+        <w:numPr>
+          <w:ilvl w:val="1"/>
+          <w:numId w:val="4"/>
+        </w:numPr>
+        <w:spacing w:line="254" w:lineRule="auto"/>
+        <w:rPr>
+          <w:sz w:val="24"/>
+          <w:szCs w:val="24"/>
+          <w:lang w:val="en-US"/>
+        </w:rPr>
+      </w:pPr>
+      <w:r>
+        <w:rPr>
+          <w:sz w:val="24"/>
+          <w:szCs w:val="24"/>
+          <w:lang w:val="en-US"/>
+        </w:rPr>
+        <w:t>Display any row randomly</w:t>
+      </w:r>
+    </w:p>
+    <w:p>
+      <w:pPr>
+        <w:pStyle w:val="ListParagraph"/>
+        <w:numPr>
+          <w:ilvl w:val="1"/>
+          <w:numId w:val="4"/>
+        </w:numPr>
+        <w:spacing w:line="254" w:lineRule="auto"/>
+        <w:rPr>
+          <w:sz w:val="24"/>
+          <w:szCs w:val="24"/>
+          <w:lang w:val="en-US"/>
+        </w:rPr>
+      </w:pPr>
+      <w:r>
+        <w:rPr>
+          <w:sz w:val="24"/>
+          <w:szCs w:val="24"/>
+          <w:lang w:val="en-US"/>
+        </w:rPr>
+        <w:t>Display list of all the companies (Company name only)</w:t>
+      </w:r>
+    </w:p>
+    <w:p>
+      <w:pPr>
+        <w:pStyle w:val="ListParagraph"/>
+        <w:numPr>
+          <w:ilvl w:val="1"/>
+          <w:numId w:val="4"/>
+        </w:numPr>
+        <w:rPr>
+          <w:sz w:val="24"/>
+          <w:szCs w:val="24"/>
+          <w:lang w:val="en-US"/>
+        </w:rPr>
+      </w:pPr>
+      <w:r>
+        <w:rPr>
+          <w:sz w:val="24"/>
+          <w:szCs w:val="24"/>
+          <w:lang w:val="en-US"/>
+        </w:rPr>
+        <w:t>Read all current price and display the highest price.</w:t>
+      </w:r>
+      <w:r>
+        <w:rPr>
+          <w:sz w:val="24"/>
+          <w:szCs w:val="24"/>
+          <w:lang w:val="en-US"/>
+        </w:rPr>
+        <w:br/>
+        <w:t>(Read all the current price, store in array and then sort an array so you will get highest price)</w:t>
+      </w:r>
+    </w:p>
+    <w:p>
+      <w:pPr>
+        <w:pStyle w:val="ListParagraph"/>
+        <w:numPr>
+          <w:ilvl w:val="0"/>
+          <w:numId w:val="4"/>
+        </w:numPr>
+        <w:spacing w:line="254" w:lineRule="auto"/>
+        <w:rPr>
+          <w:sz w:val="24"/>
+          <w:szCs w:val="24"/>
+          <w:lang w:val="en-US"/>
+        </w:rPr>
+      </w:pPr>
+      <w:r>
+        <w:rPr>
+          <w:sz w:val="24"/>
+          <w:szCs w:val="24"/>
+          <w:lang w:val="en-US"/>
+        </w:rPr>
+        <w:t xml:space="preserve">Open </w:t>
+      </w:r>
+      <w:hyperlink r:id="rId23" w:history="1">
+        <w:r>
+          <w:rPr>
+            <w:rStyle w:val="Hyperlink"/>
+            <w:sz w:val="24"/>
+            <w:szCs w:val="24"/>
+            <w:lang w:val="en-US"/>
+          </w:rPr>
+          <w:t>https://demoqa.com</w:t>
+        </w:r>
+        <w:r>
+          <w:rPr>
+            <w:rStyle w:val="Hyperlink"/>
+            <w:sz w:val="24"/>
+            <w:szCs w:val="24"/>
+            <w:lang w:val="en-US"/>
+          </w:rPr>
+          <w:t>/</w:t>
+        </w:r>
+        <w:r>
+          <w:rPr>
+            <w:rStyle w:val="Hyperlink"/>
+            <w:sz w:val="24"/>
+            <w:szCs w:val="24"/>
+            <w:lang w:val="en-US"/>
+          </w:rPr>
+          <w:t>webtables</w:t>
+        </w:r>
+      </w:hyperlink>
+      <w:r>
+        <w:rPr>
+          <w:sz w:val="24"/>
+          <w:szCs w:val="24"/>
+          <w:lang w:val="en-US"/>
+        </w:rPr>
+        <w:t xml:space="preserve"> </w:t>
+      </w:r>
+    </w:p>
+    <w:p>
+      <w:pPr>
+        <w:pStyle w:val="ListParagraph"/>
+        <w:numPr>
+          <w:ilvl w:val="1"/>
+          <w:numId w:val="4"/>
+        </w:numPr>
+        <w:spacing w:line="254" w:lineRule="auto"/>
+        <w:rPr>
+          <w:sz w:val="24"/>
+          <w:szCs w:val="24"/>
+          <w:lang w:val="en-US"/>
+        </w:rPr>
+      </w:pPr>
+      <w:r>
+        <w:rPr>
+          <w:sz w:val="24"/>
+          <w:szCs w:val="24"/>
+          <w:lang w:val="en-US"/>
+        </w:rPr>
+        <w:t>Try to display all header columns</w:t>
+      </w:r>
+    </w:p>
+    <w:p>
+      <w:pPr>
+        <w:pStyle w:val="ListParagraph"/>
+        <w:numPr>
+          <w:ilvl w:val="1"/>
+          <w:numId w:val="4"/>
+        </w:numPr>
+        <w:spacing w:line="254" w:lineRule="auto"/>
+        <w:rPr>
+          <w:sz w:val="24"/>
+          <w:szCs w:val="24"/>
+          <w:lang w:val="en-US"/>
+        </w:rPr>
+      </w:pPr>
+      <w:r>
+        <w:rPr>
+          <w:sz w:val="24"/>
+          <w:szCs w:val="24"/>
+          <w:lang w:val="en-US"/>
+        </w:rPr>
+        <w:t>Click on Add button</w:t>
+      </w:r>
+    </w:p>
+    <w:p>
+      <w:pPr>
+        <w:pStyle w:val="ListParagraph"/>
+        <w:numPr>
+          <w:ilvl w:val="1"/>
+          <w:numId w:val="4"/>
+        </w:numPr>
+        <w:spacing w:line="254" w:lineRule="auto"/>
+        <w:rPr>
+          <w:sz w:val="24"/>
+          <w:szCs w:val="24"/>
+          <w:lang w:val="en-US"/>
+        </w:rPr>
+      </w:pPr>
+      <w:r>
+        <w:rPr>
+          <w:sz w:val="24"/>
+          <w:szCs w:val="24"/>
+          <w:lang w:val="en-US"/>
+        </w:rPr>
+        <w:t>Enter all the data</w:t>
+      </w:r>
+    </w:p>
+    <w:p>
+      <w:pPr>
+        <w:pStyle w:val="ListParagraph"/>
+        <w:numPr>
+          <w:ilvl w:val="1"/>
+          <w:numId w:val="4"/>
+        </w:numPr>
+        <w:spacing w:line="254" w:lineRule="auto"/>
+        <w:rPr>
+          <w:sz w:val="24"/>
+          <w:szCs w:val="24"/>
+          <w:lang w:val="en-US"/>
+        </w:rPr>
+      </w:pPr>
+      <w:r>
+        <w:rPr>
+          <w:sz w:val="24"/>
+          <w:szCs w:val="24"/>
+          <w:lang w:val="en-US"/>
+        </w:rPr>
+        <w:t>Search the first name in First Name column</w:t>
+      </w:r>
+    </w:p>
+    <w:p>
+      <w:pPr>
+        <w:pStyle w:val="ListParagraph"/>
+        <w:numPr>
+          <w:ilvl w:val="1"/>
+          <w:numId w:val="4"/>
+        </w:numPr>
+        <w:spacing w:line="254" w:lineRule="auto"/>
+        <w:rPr>
+          <w:sz w:val="24"/>
+          <w:szCs w:val="24"/>
+          <w:lang w:val="en-US"/>
+        </w:rPr>
+      </w:pPr>
+      <w:r>
+        <w:rPr>
+          <w:sz w:val="24"/>
+          <w:szCs w:val="24"/>
+          <w:lang w:val="en-US"/>
+        </w:rPr>
+        <w:t>Click on delete button in the same row (Don’t copy the xpath of delete button from last row)</w:t>
+      </w:r>
+    </w:p>
+    <w:p>
+      <w:pPr>
+        <w:pStyle w:val="ListParagraph"/>
+        <w:numPr>
+          <w:ilvl w:val="0"/>
+          <w:numId w:val="4"/>
+        </w:numPr>
+        <w:spacing w:line="254" w:lineRule="auto"/>
+        <w:rPr>
+          <w:sz w:val="24"/>
+          <w:szCs w:val="24"/>
+          <w:lang w:val="en-US"/>
+        </w:rPr>
+      </w:pPr>
+      <w:r>
+        <w:rPr>
+          <w:sz w:val="24"/>
+          <w:szCs w:val="24"/>
+          <w:lang w:val="en-US"/>
+        </w:rPr>
+        <w:t xml:space="preserve">Open </w:t>
+      </w:r>
+      <w:hyperlink r:id="rId24" w:history="1">
+        <w:r>
+          <w:rPr>
+            <w:rStyle w:val="Hyperlink"/>
+            <w:sz w:val="24"/>
+            <w:szCs w:val="24"/>
+            <w:lang w:val="en-US"/>
+          </w:rPr>
+          <w:t>https://www.iplt20.com/points-table/men/2024</w:t>
+        </w:r>
+      </w:hyperlink>
+      <w:r>
+        <w:rPr>
+          <w:sz w:val="24"/>
+          <w:szCs w:val="24"/>
+          <w:lang w:val="en-US"/>
+        </w:rPr>
+        <w:t xml:space="preserve"> </w:t>
+      </w:r>
+    </w:p>
+    <w:p>
+      <w:pPr>
+        <w:pStyle w:val="ListParagraph"/>
+        <w:numPr>
+          <w:ilvl w:val="1"/>
+          <w:numId w:val="4"/>
+        </w:numPr>
+        <w:spacing w:line="254" w:lineRule="auto"/>
+        <w:rPr>
+          <w:sz w:val="24"/>
+          <w:szCs w:val="24"/>
+          <w:lang w:val="en-US"/>
+        </w:rPr>
+      </w:pPr>
+      <w:r>
+        <w:rPr>
+          <w:sz w:val="24"/>
+          <w:szCs w:val="24"/>
+          <w:lang w:val="en-US"/>
+        </w:rPr>
+        <w:t>Display list of all the Teams</w:t>
+      </w:r>
+    </w:p>
+    <w:p>
+      <w:pPr>
+        <w:pStyle w:val="ListParagraph"/>
+        <w:numPr>
+          <w:ilvl w:val="1"/>
+          <w:numId w:val="4"/>
+        </w:numPr>
+        <w:rPr>
+          <w:sz w:val="24"/>
+          <w:szCs w:val="24"/>
           <w:lang w:val="en-US"/>
         </w:rPr>
       </w:pPr>
       <w:bookmarkStart w:id="0" w:name="_GoBack"/>
       <w:bookmarkEnd w:id="0"/>
+      <w:r>
+        <w:rPr>
+          <w:sz w:val="24"/>
+          <w:szCs w:val="24"/>
+          <w:lang w:val="en-US"/>
+        </w:rPr>
+        <w:t>Display all result of each team about N W L</w:t>
+      </w:r>
+      <w:r>
+        <w:rPr>
+          <w:sz w:val="24"/>
+          <w:szCs w:val="24"/>
+          <w:lang w:val="en-US"/>
+        </w:rPr>
+        <w:br/>
+      </w:r>
+      <w:r>
+        <w:rPr>
+          <w:sz w:val="24"/>
+          <w:szCs w:val="24"/>
+          <w:lang w:val="en-US"/>
+        </w:rPr>
+        <w:t>Display count of N, W &amp; L</w:t>
+      </w:r>
+      <w:r>
+        <w:rPr>
+          <w:sz w:val="24"/>
+          <w:szCs w:val="24"/>
+          <w:lang w:val="en-US"/>
+        </w:rPr>
+        <w:br/>
+        <w:t>Display the result as follow</w:t>
+      </w:r>
+      <w:r>
+        <w:rPr>
+          <w:sz w:val="24"/>
+          <w:szCs w:val="24"/>
+          <w:lang w:val="en-US"/>
+        </w:rPr>
+        <w:br/>
+        <w:t>KKR</w:t>
+      </w:r>
+      <w:r>
+        <w:rPr>
+          <w:sz w:val="24"/>
+          <w:szCs w:val="24"/>
+          <w:lang w:val="en-US"/>
+        </w:rPr>
+        <w:tab/>
+        <w:t>NNWWW</w:t>
+      </w:r>
+      <w:r>
+        <w:rPr>
+          <w:sz w:val="24"/>
+          <w:szCs w:val="24"/>
+          <w:lang w:val="en-US"/>
+        </w:rPr>
+        <w:tab/>
+        <w:t>N-2, W-3, L-0</w:t>
+      </w:r>
+    </w:p>
+    <w:p>
+      <w:pPr>
+        <w:pStyle w:val="ListParagraph"/>
+        <w:spacing w:line="254" w:lineRule="auto"/>
+        <w:ind w:left="1440"/>
+        <w:rPr>
+          <w:sz w:val="24"/>
+          <w:szCs w:val="24"/>
+          <w:lang w:val="en-US"/>
+        </w:rPr>
+      </w:pPr>
+    </w:p>
+    <w:p>
+      <w:pPr>
+        <w:pStyle w:val="ListParagraph"/>
+        <w:numPr>
+          <w:ilvl w:val="0"/>
+          <w:numId w:val="4"/>
+        </w:numPr>
+        <w:rPr>
+          <w:lang w:val="en-US"/>
+        </w:rPr>
+      </w:pPr>
     </w:p>
     <w:sectPr>
       <w:pgSz w:w="11906" w:h="16838"/>

</xml_diff>

<commit_message>
Date: 04 Sept 2025
</commit_message>
<xml_diff>
--- a/Assignments.docx
+++ b/Assignments.docx
@@ -62,29 +62,91 @@
           <w:lang w:val="en-US"/>
         </w:rPr>
         <w:br/>
-        <w:t>hra = 20 % of basic salary</w:t>
+      </w:r>
+      <w:proofErr w:type="spellStart"/>
+      <w:r>
+        <w:rPr>
+          <w:lang w:val="en-US"/>
+        </w:rPr>
+        <w:t>hra</w:t>
+      </w:r>
+      <w:proofErr w:type="spellEnd"/>
+      <w:r>
+        <w:rPr>
+          <w:lang w:val="en-US"/>
+        </w:rPr>
+        <w:t xml:space="preserve"> = 20 % of basic salary</w:t>
       </w:r>
       <w:r>
         <w:rPr>
           <w:lang w:val="en-US"/>
         </w:rPr>
         <w:br/>
-        <w:t>pf = 5% of basic salary</w:t>
+      </w:r>
+      <w:proofErr w:type="spellStart"/>
+      <w:r>
+        <w:rPr>
+          <w:lang w:val="en-US"/>
+        </w:rPr>
+        <w:t>pf</w:t>
+      </w:r>
+      <w:proofErr w:type="spellEnd"/>
+      <w:r>
+        <w:rPr>
+          <w:lang w:val="en-US"/>
+        </w:rPr>
+        <w:t xml:space="preserve"> = 5% of basic salary</w:t>
       </w:r>
       <w:r>
         <w:rPr>
           <w:lang w:val="en-US"/>
         </w:rPr>
         <w:br/>
-        <w:t xml:space="preserve">gross = basicSalary + da + hra </w:t>
+        <w:t xml:space="preserve">gross = </w:t>
+      </w:r>
+      <w:proofErr w:type="spellStart"/>
+      <w:r>
+        <w:rPr>
+          <w:lang w:val="en-US"/>
+        </w:rPr>
+        <w:t>basicSalary</w:t>
+      </w:r>
+      <w:proofErr w:type="spellEnd"/>
+      <w:r>
+        <w:rPr>
+          <w:lang w:val="en-US"/>
+        </w:rPr>
+        <w:t xml:space="preserve"> + da + </w:t>
+      </w:r>
+      <w:proofErr w:type="spellStart"/>
+      <w:r>
+        <w:rPr>
+          <w:lang w:val="en-US"/>
+        </w:rPr>
+        <w:t>hra</w:t>
+      </w:r>
+      <w:proofErr w:type="spellEnd"/>
+      <w:r>
+        <w:rPr>
+          <w:lang w:val="en-US"/>
+        </w:rPr>
+        <w:t xml:space="preserve"> </w:t>
       </w:r>
       <w:r>
         <w:rPr>
           <w:lang w:val="en-US"/>
         </w:rPr>
         <w:br/>
-        <w:t>net = gross – pf</w:t>
-      </w:r>
+        <w:t xml:space="preserve">net = gross – </w:t>
+      </w:r>
+      <w:proofErr w:type="spellStart"/>
+      <w:r>
+        <w:rPr>
+          <w:lang w:val="en-US"/>
+        </w:rPr>
+        <w:t>pf</w:t>
+      </w:r>
+      <w:proofErr w:type="spellEnd"/>
     </w:p>
     <w:p>
       <w:pPr>
@@ -211,13 +273,23 @@
         </w:rPr>
         <w:tab/>
       </w:r>
-      <w:r>
-        <w:rPr>
-          <w:sz w:val="24"/>
-          <w:szCs w:val="24"/>
-          <w:lang w:val="en-US"/>
-        </w:rPr>
-        <w:t>Avg Marks</w:t>
+      <w:proofErr w:type="spellStart"/>
+      <w:r>
+        <w:rPr>
+          <w:sz w:val="24"/>
+          <w:szCs w:val="24"/>
+          <w:lang w:val="en-US"/>
+        </w:rPr>
+        <w:t>Avg</w:t>
+      </w:r>
+      <w:proofErr w:type="spellEnd"/>
+      <w:r>
+        <w:rPr>
+          <w:sz w:val="24"/>
+          <w:szCs w:val="24"/>
+          <w:lang w:val="en-US"/>
+        </w:rPr>
+        <w:t xml:space="preserve"> Marks</w:t>
       </w:r>
       <w:r>
         <w:rPr>
@@ -283,8 +355,17 @@
           <w:lang w:val="en-US"/>
         </w:rPr>
         <w:tab/>
+      </w:r>
+      <w:proofErr w:type="spellStart"/>
+      <w:r>
+        <w:rPr>
+          <w:sz w:val="24"/>
+          <w:szCs w:val="24"/>
+          <w:lang w:val="en-US"/>
+        </w:rPr>
         <w:t>Dist</w:t>
       </w:r>
+      <w:proofErr w:type="spellEnd"/>
       <w:r>
         <w:rPr>
           <w:sz w:val="24"/>
@@ -600,7 +681,21 @@
         <w:rPr>
           <w:lang w:val="en-US"/>
         </w:rPr>
-        <w:t>Try getPageSource() method and tell me what is the purpose and return type of this method.</w:t>
+        <w:t xml:space="preserve">Try </w:t>
+      </w:r>
+      <w:proofErr w:type="gramStart"/>
+      <w:r>
+        <w:rPr>
+          <w:lang w:val="en-US"/>
+        </w:rPr>
+        <w:t>getPageSource(</w:t>
+      </w:r>
+      <w:proofErr w:type="gramEnd"/>
+      <w:r>
+        <w:rPr>
+          <w:lang w:val="en-US"/>
+        </w:rPr>
+        <w:t>) method and tell me what is the purpose and return type of this method.</w:t>
       </w:r>
     </w:p>
     <w:p>
@@ -1070,7 +1165,25 @@
           <w:szCs w:val="24"/>
           <w:lang w:val="en-US"/>
         </w:rPr>
-        <w:t xml:space="preserve">Enter email as </w:t>
+        <w:t xml:space="preserve">Enter email </w:t>
+      </w:r>
+      <w:proofErr w:type="spellStart"/>
+      <w:r>
+        <w:rPr>
+          <w:sz w:val="26"/>
+          <w:szCs w:val="24"/>
+          <w:lang w:val="en-US"/>
+        </w:rPr>
+        <w:t>as</w:t>
+      </w:r>
+      <w:proofErr w:type="spellEnd"/>
+      <w:r>
+        <w:rPr>
+          <w:sz w:val="26"/>
+          <w:szCs w:val="24"/>
+          <w:lang w:val="en-US"/>
+        </w:rPr>
+        <w:t xml:space="preserve"> </w:t>
       </w:r>
       <w:hyperlink r:id="rId10" w:history="1">
         <w:r>
@@ -1198,7 +1311,25 @@
           <w:szCs w:val="24"/>
           <w:lang w:val="en-US"/>
         </w:rPr>
-        <w:t>Enter username as your name (prajakta)</w:t>
+        <w:t>Enter username as your name (</w:t>
+      </w:r>
+      <w:proofErr w:type="spellStart"/>
+      <w:r>
+        <w:rPr>
+          <w:sz w:val="26"/>
+          <w:szCs w:val="24"/>
+          <w:lang w:val="en-US"/>
+        </w:rPr>
+        <w:t>prajakta</w:t>
+      </w:r>
+      <w:proofErr w:type="spellEnd"/>
+      <w:r>
+        <w:rPr>
+          <w:sz w:val="26"/>
+          <w:szCs w:val="24"/>
+          <w:lang w:val="en-US"/>
+        </w:rPr>
+        <w:t>)</w:t>
       </w:r>
     </w:p>
     <w:p>
@@ -1337,7 +1468,25 @@
           <w:szCs w:val="24"/>
           <w:lang w:val="en-US"/>
         </w:rPr>
-        <w:t>Enter rediff Id</w:t>
+        <w:t xml:space="preserve">Enter </w:t>
+      </w:r>
+      <w:proofErr w:type="spellStart"/>
+      <w:r>
+        <w:rPr>
+          <w:sz w:val="26"/>
+          <w:szCs w:val="24"/>
+          <w:lang w:val="en-US"/>
+        </w:rPr>
+        <w:t>rediff</w:t>
+      </w:r>
+      <w:proofErr w:type="spellEnd"/>
+      <w:r>
+        <w:rPr>
+          <w:sz w:val="26"/>
+          <w:szCs w:val="24"/>
+          <w:lang w:val="en-US"/>
+        </w:rPr>
+        <w:t xml:space="preserve"> Id</w:t>
       </w:r>
     </w:p>
     <w:p>
@@ -1521,7 +1670,25 @@
           <w:szCs w:val="24"/>
           <w:lang w:val="en-US"/>
         </w:rPr>
-        <w:t>Enter rediff Id</w:t>
+        <w:t xml:space="preserve">Enter </w:t>
+      </w:r>
+      <w:proofErr w:type="spellStart"/>
+      <w:r>
+        <w:rPr>
+          <w:sz w:val="26"/>
+          <w:szCs w:val="24"/>
+          <w:lang w:val="en-US"/>
+        </w:rPr>
+        <w:t>rediff</w:t>
+      </w:r>
+      <w:proofErr w:type="spellEnd"/>
+      <w:r>
+        <w:rPr>
+          <w:sz w:val="26"/>
+          <w:szCs w:val="24"/>
+          <w:lang w:val="en-US"/>
+        </w:rPr>
+        <w:t xml:space="preserve"> Id</w:t>
       </w:r>
     </w:p>
     <w:p>
@@ -1682,7 +1849,25 @@
           <w:szCs w:val="24"/>
           <w:lang w:val="en-US"/>
         </w:rPr>
-        <w:t>Enter username as your name (prajakta)</w:t>
+        <w:t>Enter username as your name (</w:t>
+      </w:r>
+      <w:proofErr w:type="spellStart"/>
+      <w:r>
+        <w:rPr>
+          <w:sz w:val="26"/>
+          <w:szCs w:val="24"/>
+          <w:lang w:val="en-US"/>
+        </w:rPr>
+        <w:t>prajakta</w:t>
+      </w:r>
+      <w:proofErr w:type="spellEnd"/>
+      <w:r>
+        <w:rPr>
+          <w:sz w:val="26"/>
+          <w:szCs w:val="24"/>
+          <w:lang w:val="en-US"/>
+        </w:rPr>
+        <w:t>)</w:t>
       </w:r>
     </w:p>
     <w:p>
@@ -1784,7 +1969,21 @@
         <w:rPr>
           <w:lang w:val="en-US"/>
         </w:rPr>
-        <w:t>Complete facebook login via relative locator</w:t>
+        <w:t xml:space="preserve">Complete </w:t>
+      </w:r>
+      <w:proofErr w:type="spellStart"/>
+      <w:r>
+        <w:rPr>
+          <w:lang w:val="en-US"/>
+        </w:rPr>
+        <w:t>facebook</w:t>
+      </w:r>
+      <w:proofErr w:type="spellEnd"/>
+      <w:r>
+        <w:rPr>
+          <w:lang w:val="en-US"/>
+        </w:rPr>
+        <w:t xml:space="preserve"> login via relative locator</w:t>
       </w:r>
       <w:r>
         <w:rPr>
@@ -2250,7 +2449,25 @@
           <w:szCs w:val="24"/>
           <w:lang w:val="en-US"/>
         </w:rPr>
-        <w:t>Enter first 4 characters from your city (Kolhapur – kolh)</w:t>
+        <w:t xml:space="preserve">Enter first 4 characters from your city (Kolhapur – </w:t>
+      </w:r>
+      <w:proofErr w:type="spellStart"/>
+      <w:r>
+        <w:rPr>
+          <w:sz w:val="24"/>
+          <w:szCs w:val="24"/>
+          <w:lang w:val="en-US"/>
+        </w:rPr>
+        <w:t>kolh</w:t>
+      </w:r>
+      <w:proofErr w:type="spellEnd"/>
+      <w:r>
+        <w:rPr>
+          <w:sz w:val="24"/>
+          <w:szCs w:val="24"/>
+          <w:lang w:val="en-US"/>
+        </w:rPr>
+        <w:t>)</w:t>
       </w:r>
     </w:p>
     <w:p>
@@ -3075,25 +3292,7 @@
             <w:szCs w:val="24"/>
             <w:lang w:val="en-US"/>
           </w:rPr>
-          <w:t>https://demoqa.com</w:t>
-        </w:r>
-        <w:r>
-          <w:rPr>
-            <w:rStyle w:val="Hyperlink"/>
-            <w:sz w:val="24"/>
-            <w:szCs w:val="24"/>
-            <w:lang w:val="en-US"/>
-          </w:rPr>
-          <w:t>/</w:t>
-        </w:r>
-        <w:r>
-          <w:rPr>
-            <w:rStyle w:val="Hyperlink"/>
-            <w:sz w:val="24"/>
-            <w:szCs w:val="24"/>
-            <w:lang w:val="en-US"/>
-          </w:rPr>
-          <w:t>webtables</w:t>
+          <w:t>https://demoqa.com/webtables</w:t>
         </w:r>
       </w:hyperlink>
       <w:r>
@@ -3298,92 +3497,501 @@
           <w:lang w:val="en-US"/>
         </w:rPr>
       </w:pPr>
+      <w:r>
+        <w:rPr>
+          <w:sz w:val="24"/>
+          <w:szCs w:val="24"/>
+          <w:lang w:val="en-US"/>
+        </w:rPr>
+        <w:t>Display all result of each team about N W L</w:t>
+      </w:r>
+      <w:r>
+        <w:rPr>
+          <w:sz w:val="24"/>
+          <w:szCs w:val="24"/>
+          <w:lang w:val="en-US"/>
+        </w:rPr>
+        <w:br/>
+      </w:r>
+      <w:r>
+        <w:rPr>
+          <w:sz w:val="24"/>
+          <w:szCs w:val="24"/>
+          <w:lang w:val="en-US"/>
+        </w:rPr>
+        <w:t>Display count of N, W &amp; L</w:t>
+      </w:r>
+      <w:r>
+        <w:rPr>
+          <w:sz w:val="24"/>
+          <w:szCs w:val="24"/>
+          <w:lang w:val="en-US"/>
+        </w:rPr>
+        <w:br/>
+        <w:t>Display the result as follow</w:t>
+      </w:r>
+      <w:r>
+        <w:rPr>
+          <w:sz w:val="24"/>
+          <w:szCs w:val="24"/>
+          <w:lang w:val="en-US"/>
+        </w:rPr>
+        <w:br/>
+        <w:t>KKR</w:t>
+      </w:r>
+      <w:r>
+        <w:rPr>
+          <w:sz w:val="24"/>
+          <w:szCs w:val="24"/>
+          <w:lang w:val="en-US"/>
+        </w:rPr>
+        <w:tab/>
+        <w:t>NNWWW</w:t>
+      </w:r>
+      <w:r>
+        <w:rPr>
+          <w:sz w:val="24"/>
+          <w:szCs w:val="24"/>
+          <w:lang w:val="en-US"/>
+        </w:rPr>
+        <w:tab/>
+        <w:t>N-2, W-3, L-0</w:t>
+      </w:r>
+    </w:p>
+    <w:p>
+      <w:pPr>
+        <w:pStyle w:val="ListParagraph"/>
+        <w:spacing w:line="254" w:lineRule="auto"/>
+        <w:ind w:left="1440"/>
+        <w:rPr>
+          <w:sz w:val="24"/>
+          <w:szCs w:val="24"/>
+          <w:lang w:val="en-US"/>
+        </w:rPr>
+      </w:pPr>
+    </w:p>
+    <w:p>
+      <w:pPr>
+        <w:pStyle w:val="ListParagraph"/>
+        <w:numPr>
+          <w:ilvl w:val="0"/>
+          <w:numId w:val="4"/>
+        </w:numPr>
+        <w:spacing w:line="254" w:lineRule="auto"/>
+        <w:rPr>
+          <w:sz w:val="24"/>
+          <w:szCs w:val="24"/>
+          <w:lang w:val="en-US"/>
+        </w:rPr>
+      </w:pPr>
+      <w:r>
+        <w:rPr>
+          <w:sz w:val="24"/>
+          <w:szCs w:val="24"/>
+          <w:lang w:val="en-US"/>
+        </w:rPr>
+        <w:t xml:space="preserve">Complete the registration process on </w:t>
+      </w:r>
+      <w:hyperlink r:id="rId25" w:history="1">
+        <w:r>
+          <w:rPr>
+            <w:rStyle w:val="Hyperlink"/>
+            <w:sz w:val="24"/>
+            <w:szCs w:val="24"/>
+            <w:lang w:val="en-US"/>
+          </w:rPr>
+          <w:t>https://demoqa.com/automation-practice-form</w:t>
+        </w:r>
+      </w:hyperlink>
+    </w:p>
+    <w:p>
+      <w:pPr>
+        <w:pStyle w:val="ListParagraph"/>
+        <w:numPr>
+          <w:ilvl w:val="0"/>
+          <w:numId w:val="4"/>
+        </w:numPr>
+        <w:spacing w:line="254" w:lineRule="auto"/>
+        <w:rPr>
+          <w:sz w:val="24"/>
+          <w:szCs w:val="24"/>
+          <w:lang w:val="en-US"/>
+        </w:rPr>
+      </w:pPr>
+      <w:r>
+        <w:rPr>
+          <w:sz w:val="24"/>
+          <w:szCs w:val="24"/>
+          <w:lang w:val="en-US"/>
+        </w:rPr>
+        <w:t xml:space="preserve">Open </w:t>
+      </w:r>
+      <w:hyperlink r:id="rId26" w:history="1">
+        <w:r>
+          <w:rPr>
+            <w:rStyle w:val="Hyperlink"/>
+            <w:sz w:val="24"/>
+            <w:szCs w:val="24"/>
+            <w:lang w:val="en-US"/>
+          </w:rPr>
+          <w:t>https://sampleapp.tricentis.com/101/index.php</w:t>
+        </w:r>
+      </w:hyperlink>
+    </w:p>
+    <w:p>
+      <w:pPr>
+        <w:pStyle w:val="ListParagraph"/>
+        <w:numPr>
+          <w:ilvl w:val="1"/>
+          <w:numId w:val="4"/>
+        </w:numPr>
+        <w:spacing w:line="254" w:lineRule="auto"/>
+        <w:rPr>
+          <w:sz w:val="24"/>
+          <w:szCs w:val="24"/>
+          <w:lang w:val="en-US"/>
+        </w:rPr>
+      </w:pPr>
+      <w:r>
+        <w:rPr>
+          <w:sz w:val="24"/>
+          <w:szCs w:val="24"/>
+          <w:lang w:val="en-US"/>
+        </w:rPr>
+        <w:t>Click on Automobile</w:t>
+      </w:r>
+    </w:p>
+    <w:p>
+      <w:pPr>
+        <w:pStyle w:val="ListParagraph"/>
+        <w:numPr>
+          <w:ilvl w:val="1"/>
+          <w:numId w:val="4"/>
+        </w:numPr>
+        <w:spacing w:line="254" w:lineRule="auto"/>
+        <w:rPr>
+          <w:sz w:val="24"/>
+          <w:szCs w:val="24"/>
+          <w:lang w:val="en-US"/>
+        </w:rPr>
+      </w:pPr>
+      <w:r>
+        <w:rPr>
+          <w:sz w:val="24"/>
+          <w:szCs w:val="24"/>
+          <w:lang w:val="en-US"/>
+        </w:rPr>
+        <w:lastRenderedPageBreak/>
+        <w:t>Click on Enter Insurant Data</w:t>
+      </w:r>
+    </w:p>
+    <w:p>
+      <w:pPr>
+        <w:pStyle w:val="ListParagraph"/>
+        <w:numPr>
+          <w:ilvl w:val="1"/>
+          <w:numId w:val="4"/>
+        </w:numPr>
+        <w:spacing w:line="254" w:lineRule="auto"/>
+        <w:rPr>
+          <w:sz w:val="24"/>
+          <w:szCs w:val="24"/>
+          <w:lang w:val="en-US"/>
+        </w:rPr>
+      </w:pPr>
+      <w:r>
+        <w:rPr>
+          <w:sz w:val="24"/>
+          <w:szCs w:val="24"/>
+          <w:lang w:val="en-US"/>
+        </w:rPr>
+        <w:t>Upload your picture</w:t>
+      </w:r>
+    </w:p>
+    <w:p>
+      <w:pPr>
+        <w:pStyle w:val="ListParagraph"/>
+        <w:numPr>
+          <w:ilvl w:val="0"/>
+          <w:numId w:val="4"/>
+        </w:numPr>
+        <w:spacing w:line="254" w:lineRule="auto"/>
+        <w:rPr>
+          <w:sz w:val="24"/>
+          <w:szCs w:val="24"/>
+          <w:lang w:val="en-US"/>
+        </w:rPr>
+      </w:pPr>
+      <w:r>
+        <w:rPr>
+          <w:sz w:val="24"/>
+          <w:szCs w:val="24"/>
+          <w:lang w:val="en-US"/>
+        </w:rPr>
+        <w:t xml:space="preserve">Open </w:t>
+      </w:r>
+      <w:hyperlink r:id="rId27" w:history="1">
+        <w:r>
+          <w:rPr>
+            <w:rStyle w:val="Hyperlink"/>
+            <w:sz w:val="24"/>
+            <w:szCs w:val="24"/>
+            <w:lang w:val="en-US"/>
+          </w:rPr>
+          <w:t>https://omayo.blogspot.com/</w:t>
+        </w:r>
+      </w:hyperlink>
+    </w:p>
+    <w:p>
+      <w:pPr>
+        <w:pStyle w:val="ListParagraph"/>
+        <w:numPr>
+          <w:ilvl w:val="1"/>
+          <w:numId w:val="4"/>
+        </w:numPr>
+        <w:spacing w:line="254" w:lineRule="auto"/>
+        <w:rPr>
+          <w:sz w:val="24"/>
+          <w:szCs w:val="24"/>
+          <w:lang w:val="en-US"/>
+        </w:rPr>
+      </w:pPr>
+      <w:r>
+        <w:rPr>
+          <w:sz w:val="24"/>
+          <w:szCs w:val="24"/>
+          <w:lang w:val="en-US"/>
+        </w:rPr>
+        <w:t xml:space="preserve">Click on </w:t>
+      </w:r>
+      <w:proofErr w:type="spellStart"/>
+      <w:r>
+        <w:rPr>
+          <w:sz w:val="24"/>
+          <w:szCs w:val="24"/>
+          <w:lang w:val="en-US"/>
+        </w:rPr>
+        <w:t>ClickToGetAlert</w:t>
+      </w:r>
+      <w:proofErr w:type="spellEnd"/>
+      <w:r>
+        <w:rPr>
+          <w:sz w:val="24"/>
+          <w:szCs w:val="24"/>
+          <w:lang w:val="en-US"/>
+        </w:rPr>
+        <w:t xml:space="preserve"> button</w:t>
+      </w:r>
+    </w:p>
+    <w:p>
+      <w:pPr>
+        <w:pStyle w:val="ListParagraph"/>
+        <w:numPr>
+          <w:ilvl w:val="1"/>
+          <w:numId w:val="4"/>
+        </w:numPr>
+        <w:spacing w:line="254" w:lineRule="auto"/>
+        <w:rPr>
+          <w:sz w:val="24"/>
+          <w:szCs w:val="24"/>
+          <w:lang w:val="en-US"/>
+        </w:rPr>
+      </w:pPr>
+      <w:r>
+        <w:rPr>
+          <w:sz w:val="24"/>
+          <w:szCs w:val="24"/>
+          <w:lang w:val="en-US"/>
+        </w:rPr>
+        <w:t>Display the text on alert</w:t>
+      </w:r>
+    </w:p>
+    <w:p>
+      <w:pPr>
+        <w:pStyle w:val="ListParagraph"/>
+        <w:numPr>
+          <w:ilvl w:val="1"/>
+          <w:numId w:val="4"/>
+        </w:numPr>
+        <w:spacing w:line="254" w:lineRule="auto"/>
+        <w:rPr>
+          <w:sz w:val="24"/>
+          <w:szCs w:val="24"/>
+          <w:lang w:val="en-US"/>
+        </w:rPr>
+      </w:pPr>
+      <w:r>
+        <w:rPr>
+          <w:sz w:val="24"/>
+          <w:szCs w:val="24"/>
+          <w:lang w:val="en-US"/>
+        </w:rPr>
+        <w:t>Click on Ok button</w:t>
+      </w:r>
+    </w:p>
+    <w:p>
+      <w:pPr>
+        <w:pStyle w:val="ListParagraph"/>
+        <w:numPr>
+          <w:ilvl w:val="1"/>
+          <w:numId w:val="4"/>
+        </w:numPr>
+        <w:spacing w:line="254" w:lineRule="auto"/>
+        <w:rPr>
+          <w:sz w:val="24"/>
+          <w:szCs w:val="24"/>
+          <w:lang w:val="en-US"/>
+        </w:rPr>
+      </w:pPr>
+      <w:r>
+        <w:rPr>
+          <w:sz w:val="24"/>
+          <w:szCs w:val="24"/>
+          <w:lang w:val="en-US"/>
+        </w:rPr>
+        <w:t xml:space="preserve">Click on </w:t>
+      </w:r>
+      <w:proofErr w:type="spellStart"/>
+      <w:r>
+        <w:rPr>
+          <w:sz w:val="24"/>
+          <w:szCs w:val="24"/>
+          <w:lang w:val="en-US"/>
+        </w:rPr>
+        <w:t>GetPrompt</w:t>
+      </w:r>
+      <w:proofErr w:type="spellEnd"/>
+      <w:r>
+        <w:rPr>
+          <w:sz w:val="24"/>
+          <w:szCs w:val="24"/>
+          <w:lang w:val="en-US"/>
+        </w:rPr>
+        <w:t xml:space="preserve"> Button</w:t>
+      </w:r>
+    </w:p>
+    <w:p>
+      <w:pPr>
+        <w:pStyle w:val="ListParagraph"/>
+        <w:numPr>
+          <w:ilvl w:val="1"/>
+          <w:numId w:val="4"/>
+        </w:numPr>
+        <w:spacing w:line="254" w:lineRule="auto"/>
+        <w:rPr>
+          <w:sz w:val="24"/>
+          <w:szCs w:val="24"/>
+          <w:lang w:val="en-US"/>
+        </w:rPr>
+      </w:pPr>
+      <w:r>
+        <w:rPr>
+          <w:sz w:val="24"/>
+          <w:szCs w:val="24"/>
+          <w:lang w:val="en-US"/>
+        </w:rPr>
+        <w:t xml:space="preserve">Enter your name </w:t>
+      </w:r>
+    </w:p>
+    <w:p>
+      <w:pPr>
+        <w:pStyle w:val="ListParagraph"/>
+        <w:numPr>
+          <w:ilvl w:val="1"/>
+          <w:numId w:val="4"/>
+        </w:numPr>
+        <w:spacing w:line="254" w:lineRule="auto"/>
+        <w:rPr>
+          <w:sz w:val="24"/>
+          <w:szCs w:val="24"/>
+          <w:lang w:val="en-US"/>
+        </w:rPr>
+      </w:pPr>
+      <w:r>
+        <w:rPr>
+          <w:sz w:val="24"/>
+          <w:szCs w:val="24"/>
+          <w:lang w:val="en-US"/>
+        </w:rPr>
+        <w:t>Click on Ok button</w:t>
+      </w:r>
+    </w:p>
+    <w:p>
+      <w:pPr>
+        <w:pStyle w:val="ListParagraph"/>
+        <w:numPr>
+          <w:ilvl w:val="1"/>
+          <w:numId w:val="4"/>
+        </w:numPr>
+        <w:spacing w:line="254" w:lineRule="auto"/>
+        <w:rPr>
+          <w:sz w:val="24"/>
+          <w:szCs w:val="24"/>
+          <w:lang w:val="en-US"/>
+        </w:rPr>
+      </w:pPr>
+      <w:r>
+        <w:rPr>
+          <w:sz w:val="24"/>
+          <w:szCs w:val="24"/>
+          <w:lang w:val="en-US"/>
+        </w:rPr>
+        <w:t xml:space="preserve">Click on </w:t>
+      </w:r>
+      <w:proofErr w:type="spellStart"/>
+      <w:r>
+        <w:rPr>
+          <w:sz w:val="24"/>
+          <w:szCs w:val="24"/>
+          <w:lang w:val="en-US"/>
+        </w:rPr>
+        <w:t>GetConfirmation</w:t>
+      </w:r>
+      <w:proofErr w:type="spellEnd"/>
+      <w:r>
+        <w:rPr>
+          <w:sz w:val="24"/>
+          <w:szCs w:val="24"/>
+          <w:lang w:val="en-US"/>
+        </w:rPr>
+        <w:t xml:space="preserve"> Button </w:t>
+      </w:r>
+    </w:p>
+    <w:p>
+      <w:pPr>
+        <w:pStyle w:val="ListParagraph"/>
+        <w:numPr>
+          <w:ilvl w:val="1"/>
+          <w:numId w:val="4"/>
+        </w:numPr>
+        <w:rPr>
+          <w:sz w:val="24"/>
+          <w:szCs w:val="24"/>
+          <w:lang w:val="en-US"/>
+        </w:rPr>
+      </w:pPr>
+      <w:r>
+        <w:rPr>
+          <w:sz w:val="24"/>
+          <w:szCs w:val="24"/>
+          <w:lang w:val="en-US"/>
+        </w:rPr>
+        <w:t>Click on Cancel button</w:t>
+      </w:r>
+    </w:p>
+    <w:p>
+      <w:pPr>
+        <w:pStyle w:val="ListParagraph"/>
+        <w:numPr>
+          <w:ilvl w:val="0"/>
+          <w:numId w:val="4"/>
+        </w:numPr>
+        <w:rPr>
+          <w:lang w:val="en-US"/>
+        </w:rPr>
+      </w:pPr>
       <w:bookmarkStart w:id="0" w:name="_GoBack"/>
       <w:bookmarkEnd w:id="0"/>
-      <w:r>
-        <w:rPr>
-          <w:sz w:val="24"/>
-          <w:szCs w:val="24"/>
-          <w:lang w:val="en-US"/>
-        </w:rPr>
-        <w:t>Display all result of each team about N W L</w:t>
-      </w:r>
-      <w:r>
-        <w:rPr>
-          <w:sz w:val="24"/>
-          <w:szCs w:val="24"/>
-          <w:lang w:val="en-US"/>
-        </w:rPr>
-        <w:br/>
-      </w:r>
-      <w:r>
-        <w:rPr>
-          <w:sz w:val="24"/>
-          <w:szCs w:val="24"/>
-          <w:lang w:val="en-US"/>
-        </w:rPr>
-        <w:t>Display count of N, W &amp; L</w:t>
-      </w:r>
-      <w:r>
-        <w:rPr>
-          <w:sz w:val="24"/>
-          <w:szCs w:val="24"/>
-          <w:lang w:val="en-US"/>
-        </w:rPr>
-        <w:br/>
-        <w:t>Display the result as follow</w:t>
-      </w:r>
-      <w:r>
-        <w:rPr>
-          <w:sz w:val="24"/>
-          <w:szCs w:val="24"/>
-          <w:lang w:val="en-US"/>
-        </w:rPr>
-        <w:br/>
-        <w:t>KKR</w:t>
-      </w:r>
-      <w:r>
-        <w:rPr>
-          <w:sz w:val="24"/>
-          <w:szCs w:val="24"/>
-          <w:lang w:val="en-US"/>
-        </w:rPr>
-        <w:tab/>
-        <w:t>NNWWW</w:t>
-      </w:r>
-      <w:r>
-        <w:rPr>
-          <w:sz w:val="24"/>
-          <w:szCs w:val="24"/>
-          <w:lang w:val="en-US"/>
-        </w:rPr>
-        <w:tab/>
-        <w:t>N-2, W-3, L-0</w:t>
-      </w:r>
-    </w:p>
-    <w:p>
-      <w:pPr>
-        <w:pStyle w:val="ListParagraph"/>
-        <w:spacing w:line="254" w:lineRule="auto"/>
-        <w:ind w:left="1440"/>
-        <w:rPr>
-          <w:sz w:val="24"/>
-          <w:szCs w:val="24"/>
-          <w:lang w:val="en-US"/>
-        </w:rPr>
-      </w:pPr>
-    </w:p>
-    <w:p>
-      <w:pPr>
-        <w:pStyle w:val="ListParagraph"/>
-        <w:numPr>
-          <w:ilvl w:val="0"/>
-          <w:numId w:val="4"/>
-        </w:numPr>
-        <w:rPr>
-          <w:lang w:val="en-US"/>
-        </w:rPr>
-      </w:pPr>
     </w:p>
     <w:sectPr>
       <w:pgSz w:w="11906" w:h="16838"/>

</xml_diff>

<commit_message>
Date: 13 Sept 2025
</commit_message>
<xml_diff>
--- a/Assignments.docx
+++ b/Assignments.docx
@@ -62,29 +62,91 @@
           <w:lang w:val="en-US"/>
         </w:rPr>
         <w:br/>
-        <w:t>hra = 20 % of basic salary</w:t>
+      </w:r>
+      <w:proofErr w:type="spellStart"/>
+      <w:r>
+        <w:rPr>
+          <w:lang w:val="en-US"/>
+        </w:rPr>
+        <w:t>hra</w:t>
+      </w:r>
+      <w:proofErr w:type="spellEnd"/>
+      <w:r>
+        <w:rPr>
+          <w:lang w:val="en-US"/>
+        </w:rPr>
+        <w:t xml:space="preserve"> = 20 % of basic salary</w:t>
       </w:r>
       <w:r>
         <w:rPr>
           <w:lang w:val="en-US"/>
         </w:rPr>
         <w:br/>
-        <w:t>pf = 5% of basic salary</w:t>
+      </w:r>
+      <w:proofErr w:type="spellStart"/>
+      <w:r>
+        <w:rPr>
+          <w:lang w:val="en-US"/>
+        </w:rPr>
+        <w:t>pf</w:t>
+      </w:r>
+      <w:proofErr w:type="spellEnd"/>
+      <w:r>
+        <w:rPr>
+          <w:lang w:val="en-US"/>
+        </w:rPr>
+        <w:t xml:space="preserve"> = 5% of basic salary</w:t>
       </w:r>
       <w:r>
         <w:rPr>
           <w:lang w:val="en-US"/>
         </w:rPr>
         <w:br/>
-        <w:t xml:space="preserve">gross = basicSalary + da + hra </w:t>
+        <w:t xml:space="preserve">gross = </w:t>
+      </w:r>
+      <w:proofErr w:type="spellStart"/>
+      <w:r>
+        <w:rPr>
+          <w:lang w:val="en-US"/>
+        </w:rPr>
+        <w:t>basicSalary</w:t>
+      </w:r>
+      <w:proofErr w:type="spellEnd"/>
+      <w:r>
+        <w:rPr>
+          <w:lang w:val="en-US"/>
+        </w:rPr>
+        <w:t xml:space="preserve"> + da + </w:t>
+      </w:r>
+      <w:proofErr w:type="spellStart"/>
+      <w:r>
+        <w:rPr>
+          <w:lang w:val="en-US"/>
+        </w:rPr>
+        <w:t>hra</w:t>
+      </w:r>
+      <w:proofErr w:type="spellEnd"/>
+      <w:r>
+        <w:rPr>
+          <w:lang w:val="en-US"/>
+        </w:rPr>
+        <w:t xml:space="preserve"> </w:t>
       </w:r>
       <w:r>
         <w:rPr>
           <w:lang w:val="en-US"/>
         </w:rPr>
         <w:br/>
-        <w:t>net = gross – pf</w:t>
-      </w:r>
+        <w:t xml:space="preserve">net = gross – </w:t>
+      </w:r>
+      <w:proofErr w:type="spellStart"/>
+      <w:r>
+        <w:rPr>
+          <w:lang w:val="en-US"/>
+        </w:rPr>
+        <w:t>pf</w:t>
+      </w:r>
+      <w:proofErr w:type="spellEnd"/>
     </w:p>
     <w:p>
       <w:pPr>
@@ -211,13 +273,23 @@
         </w:rPr>
         <w:tab/>
       </w:r>
-      <w:r>
-        <w:rPr>
-          <w:sz w:val="24"/>
-          <w:szCs w:val="24"/>
-          <w:lang w:val="en-US"/>
-        </w:rPr>
-        <w:t>Avg Marks</w:t>
+      <w:proofErr w:type="spellStart"/>
+      <w:r>
+        <w:rPr>
+          <w:sz w:val="24"/>
+          <w:szCs w:val="24"/>
+          <w:lang w:val="en-US"/>
+        </w:rPr>
+        <w:t>Avg</w:t>
+      </w:r>
+      <w:proofErr w:type="spellEnd"/>
+      <w:r>
+        <w:rPr>
+          <w:sz w:val="24"/>
+          <w:szCs w:val="24"/>
+          <w:lang w:val="en-US"/>
+        </w:rPr>
+        <w:t xml:space="preserve"> Marks</w:t>
       </w:r>
       <w:r>
         <w:rPr>
@@ -283,8 +355,17 @@
           <w:lang w:val="en-US"/>
         </w:rPr>
         <w:tab/>
+      </w:r>
+      <w:proofErr w:type="spellStart"/>
+      <w:r>
+        <w:rPr>
+          <w:sz w:val="24"/>
+          <w:szCs w:val="24"/>
+          <w:lang w:val="en-US"/>
+        </w:rPr>
         <w:t>Dist</w:t>
       </w:r>
+      <w:proofErr w:type="spellEnd"/>
       <w:r>
         <w:rPr>
           <w:sz w:val="24"/>
@@ -600,7 +681,21 @@
         <w:rPr>
           <w:lang w:val="en-US"/>
         </w:rPr>
-        <w:t>Try getPageSource() method and tell me what is the purpose and return type of this method.</w:t>
+        <w:t xml:space="preserve">Try </w:t>
+      </w:r>
+      <w:proofErr w:type="gramStart"/>
+      <w:r>
+        <w:rPr>
+          <w:lang w:val="en-US"/>
+        </w:rPr>
+        <w:t>getPageSource(</w:t>
+      </w:r>
+      <w:proofErr w:type="gramEnd"/>
+      <w:r>
+        <w:rPr>
+          <w:lang w:val="en-US"/>
+        </w:rPr>
+        <w:t>) method and tell me what is the purpose and return type of this method.</w:t>
       </w:r>
     </w:p>
     <w:p>
@@ -1070,7 +1165,25 @@
           <w:szCs w:val="24"/>
           <w:lang w:val="en-US"/>
         </w:rPr>
-        <w:t xml:space="preserve">Enter email as </w:t>
+        <w:t xml:space="preserve">Enter email </w:t>
+      </w:r>
+      <w:proofErr w:type="spellStart"/>
+      <w:r>
+        <w:rPr>
+          <w:sz w:val="26"/>
+          <w:szCs w:val="24"/>
+          <w:lang w:val="en-US"/>
+        </w:rPr>
+        <w:t>as</w:t>
+      </w:r>
+      <w:proofErr w:type="spellEnd"/>
+      <w:r>
+        <w:rPr>
+          <w:sz w:val="26"/>
+          <w:szCs w:val="24"/>
+          <w:lang w:val="en-US"/>
+        </w:rPr>
+        <w:t xml:space="preserve"> </w:t>
       </w:r>
       <w:hyperlink r:id="rId10" w:history="1">
         <w:r>
@@ -1198,7 +1311,25 @@
           <w:szCs w:val="24"/>
           <w:lang w:val="en-US"/>
         </w:rPr>
-        <w:t>Enter username as your name (prajakta)</w:t>
+        <w:t>Enter username as your name (</w:t>
+      </w:r>
+      <w:proofErr w:type="spellStart"/>
+      <w:r>
+        <w:rPr>
+          <w:sz w:val="26"/>
+          <w:szCs w:val="24"/>
+          <w:lang w:val="en-US"/>
+        </w:rPr>
+        <w:t>prajakta</w:t>
+      </w:r>
+      <w:proofErr w:type="spellEnd"/>
+      <w:r>
+        <w:rPr>
+          <w:sz w:val="26"/>
+          <w:szCs w:val="24"/>
+          <w:lang w:val="en-US"/>
+        </w:rPr>
+        <w:t>)</w:t>
       </w:r>
     </w:p>
     <w:p>
@@ -1337,7 +1468,25 @@
           <w:szCs w:val="24"/>
           <w:lang w:val="en-US"/>
         </w:rPr>
-        <w:t>Enter rediff Id</w:t>
+        <w:t xml:space="preserve">Enter </w:t>
+      </w:r>
+      <w:proofErr w:type="spellStart"/>
+      <w:r>
+        <w:rPr>
+          <w:sz w:val="26"/>
+          <w:szCs w:val="24"/>
+          <w:lang w:val="en-US"/>
+        </w:rPr>
+        <w:t>rediff</w:t>
+      </w:r>
+      <w:proofErr w:type="spellEnd"/>
+      <w:r>
+        <w:rPr>
+          <w:sz w:val="26"/>
+          <w:szCs w:val="24"/>
+          <w:lang w:val="en-US"/>
+        </w:rPr>
+        <w:t xml:space="preserve"> Id</w:t>
       </w:r>
     </w:p>
     <w:p>
@@ -1521,7 +1670,25 @@
           <w:szCs w:val="24"/>
           <w:lang w:val="en-US"/>
         </w:rPr>
-        <w:t>Enter rediff Id</w:t>
+        <w:t xml:space="preserve">Enter </w:t>
+      </w:r>
+      <w:proofErr w:type="spellStart"/>
+      <w:r>
+        <w:rPr>
+          <w:sz w:val="26"/>
+          <w:szCs w:val="24"/>
+          <w:lang w:val="en-US"/>
+        </w:rPr>
+        <w:t>rediff</w:t>
+      </w:r>
+      <w:proofErr w:type="spellEnd"/>
+      <w:r>
+        <w:rPr>
+          <w:sz w:val="26"/>
+          <w:szCs w:val="24"/>
+          <w:lang w:val="en-US"/>
+        </w:rPr>
+        <w:t xml:space="preserve"> Id</w:t>
       </w:r>
     </w:p>
     <w:p>
@@ -1682,7 +1849,25 @@
           <w:szCs w:val="24"/>
           <w:lang w:val="en-US"/>
         </w:rPr>
-        <w:t>Enter username as your name (prajakta)</w:t>
+        <w:t>Enter username as your name (</w:t>
+      </w:r>
+      <w:proofErr w:type="spellStart"/>
+      <w:r>
+        <w:rPr>
+          <w:sz w:val="26"/>
+          <w:szCs w:val="24"/>
+          <w:lang w:val="en-US"/>
+        </w:rPr>
+        <w:t>prajakta</w:t>
+      </w:r>
+      <w:proofErr w:type="spellEnd"/>
+      <w:r>
+        <w:rPr>
+          <w:sz w:val="26"/>
+          <w:szCs w:val="24"/>
+          <w:lang w:val="en-US"/>
+        </w:rPr>
+        <w:t>)</w:t>
       </w:r>
     </w:p>
     <w:p>
@@ -1784,7 +1969,21 @@
         <w:rPr>
           <w:lang w:val="en-US"/>
         </w:rPr>
-        <w:t>Complete facebook login via relative locator</w:t>
+        <w:t xml:space="preserve">Complete </w:t>
+      </w:r>
+      <w:proofErr w:type="spellStart"/>
+      <w:r>
+        <w:rPr>
+          <w:lang w:val="en-US"/>
+        </w:rPr>
+        <w:t>facebook</w:t>
+      </w:r>
+      <w:proofErr w:type="spellEnd"/>
+      <w:r>
+        <w:rPr>
+          <w:lang w:val="en-US"/>
+        </w:rPr>
+        <w:t xml:space="preserve"> login via relative locator</w:t>
       </w:r>
       <w:r>
         <w:rPr>
@@ -2250,7 +2449,25 @@
           <w:szCs w:val="24"/>
           <w:lang w:val="en-US"/>
         </w:rPr>
-        <w:t>Enter first 4 characters from your city (Kolhapur – kolh)</w:t>
+        <w:t xml:space="preserve">Enter first 4 characters from your city (Kolhapur – </w:t>
+      </w:r>
+      <w:proofErr w:type="spellStart"/>
+      <w:r>
+        <w:rPr>
+          <w:sz w:val="24"/>
+          <w:szCs w:val="24"/>
+          <w:lang w:val="en-US"/>
+        </w:rPr>
+        <w:t>kolh</w:t>
+      </w:r>
+      <w:proofErr w:type="spellEnd"/>
+      <w:r>
+        <w:rPr>
+          <w:sz w:val="24"/>
+          <w:szCs w:val="24"/>
+          <w:lang w:val="en-US"/>
+        </w:rPr>
+        <w:t>)</w:t>
       </w:r>
     </w:p>
     <w:p>
@@ -3545,7 +3762,25 @@
           <w:szCs w:val="24"/>
           <w:lang w:val="en-US"/>
         </w:rPr>
-        <w:t>Click on ClickToGetAlert button</w:t>
+        <w:t xml:space="preserve">Click on </w:t>
+      </w:r>
+      <w:proofErr w:type="spellStart"/>
+      <w:r>
+        <w:rPr>
+          <w:sz w:val="24"/>
+          <w:szCs w:val="24"/>
+          <w:lang w:val="en-US"/>
+        </w:rPr>
+        <w:t>ClickToGetAlert</w:t>
+      </w:r>
+      <w:proofErr w:type="spellEnd"/>
+      <w:r>
+        <w:rPr>
+          <w:sz w:val="24"/>
+          <w:szCs w:val="24"/>
+          <w:lang w:val="en-US"/>
+        </w:rPr>
+        <w:t xml:space="preserve"> button</w:t>
       </w:r>
     </w:p>
     <w:p>
@@ -3614,7 +3849,25 @@
           <w:szCs w:val="24"/>
           <w:lang w:val="en-US"/>
         </w:rPr>
-        <w:t>Click on GetPrompt Button</w:t>
+        <w:t xml:space="preserve">Click on </w:t>
+      </w:r>
+      <w:proofErr w:type="spellStart"/>
+      <w:r>
+        <w:rPr>
+          <w:sz w:val="24"/>
+          <w:szCs w:val="24"/>
+          <w:lang w:val="en-US"/>
+        </w:rPr>
+        <w:t>GetPrompt</w:t>
+      </w:r>
+      <w:proofErr w:type="spellEnd"/>
+      <w:r>
+        <w:rPr>
+          <w:sz w:val="24"/>
+          <w:szCs w:val="24"/>
+          <w:lang w:val="en-US"/>
+        </w:rPr>
+        <w:t xml:space="preserve"> Button</w:t>
       </w:r>
     </w:p>
     <w:p>
@@ -3683,7 +3936,25 @@
           <w:szCs w:val="24"/>
           <w:lang w:val="en-US"/>
         </w:rPr>
-        <w:t xml:space="preserve">Click on GetConfirmation Button </w:t>
+        <w:t xml:space="preserve">Click on </w:t>
+      </w:r>
+      <w:proofErr w:type="spellStart"/>
+      <w:r>
+        <w:rPr>
+          <w:sz w:val="24"/>
+          <w:szCs w:val="24"/>
+          <w:lang w:val="en-US"/>
+        </w:rPr>
+        <w:t>GetConfirmation</w:t>
+      </w:r>
+      <w:proofErr w:type="spellEnd"/>
+      <w:r>
+        <w:rPr>
+          <w:sz w:val="24"/>
+          <w:szCs w:val="24"/>
+          <w:lang w:val="en-US"/>
+        </w:rPr>
+        <w:t xml:space="preserve"> Button </w:t>
       </w:r>
     </w:p>
     <w:p>
@@ -4038,8 +4309,18 @@
           <w:szCs w:val="24"/>
           <w:lang w:val="en-US"/>
         </w:rPr>
-        <w:t>Login using data provided in step no h &amp; i</w:t>
-      </w:r>
+        <w:t xml:space="preserve">Login using data provided in step no h &amp; </w:t>
+      </w:r>
+      <w:proofErr w:type="spellStart"/>
+      <w:r>
+        <w:rPr>
+          <w:sz w:val="24"/>
+          <w:szCs w:val="24"/>
+          <w:lang w:val="en-US"/>
+        </w:rPr>
+        <w:t>i</w:t>
+      </w:r>
+      <w:proofErr w:type="spellEnd"/>
     </w:p>
     <w:p>
       <w:pPr>
@@ -4327,30 +4608,436 @@
     </w:p>
     <w:p>
       <w:pPr>
-        <w:rPr>
-          <w:lang w:val="en-US"/>
-        </w:rPr>
-      </w:pPr>
-    </w:p>
-    <w:p>
-      <w:pPr>
-        <w:rPr>
-          <w:lang w:val="en-US"/>
-        </w:rPr>
-      </w:pPr>
-    </w:p>
-    <w:p>
-      <w:pPr>
-        <w:rPr>
-          <w:lang w:val="en-US"/>
-        </w:rPr>
-      </w:pPr>
-      <w:r>
-        <w:rPr>
-          <w:lang w:val="en-US"/>
-        </w:rPr>
-        <w:t>Project Discussion</w:t>
-      </w:r>
+        <w:pStyle w:val="ListParagraph"/>
+        <w:numPr>
+          <w:ilvl w:val="0"/>
+          <w:numId w:val="4"/>
+        </w:numPr>
+        <w:spacing w:line="256" w:lineRule="auto"/>
+        <w:rPr>
+          <w:sz w:val="24"/>
+          <w:szCs w:val="24"/>
+          <w:lang w:val="en-US"/>
+        </w:rPr>
+      </w:pPr>
+      <w:r>
+        <w:rPr>
+          <w:sz w:val="24"/>
+          <w:szCs w:val="24"/>
+          <w:lang w:val="en-US"/>
+        </w:rPr>
+        <w:t xml:space="preserve">Open </w:t>
+      </w:r>
+      <w:hyperlink r:id="rId30" w:history="1">
+        <w:r>
+          <w:rPr>
+            <w:rStyle w:val="Hyperlink"/>
+            <w:sz w:val="24"/>
+            <w:szCs w:val="24"/>
+            <w:lang w:val="en-US"/>
+          </w:rPr>
+          <w:t>https://www.fitpeo.com/revenue-calculator</w:t>
+        </w:r>
+      </w:hyperlink>
+    </w:p>
+    <w:p>
+      <w:pPr>
+        <w:pStyle w:val="ListParagraph"/>
+        <w:numPr>
+          <w:ilvl w:val="1"/>
+          <w:numId w:val="4"/>
+        </w:numPr>
+        <w:spacing w:line="256" w:lineRule="auto"/>
+        <w:rPr>
+          <w:sz w:val="24"/>
+          <w:szCs w:val="24"/>
+          <w:lang w:val="en-US"/>
+        </w:rPr>
+      </w:pPr>
+      <w:r>
+        <w:rPr>
+          <w:sz w:val="24"/>
+          <w:szCs w:val="24"/>
+          <w:lang w:val="en-US"/>
+        </w:rPr>
+        <w:t>Try scrolling slider so that the value will become 800</w:t>
+      </w:r>
+    </w:p>
+    <w:p>
+      <w:pPr>
+        <w:pStyle w:val="ListParagraph"/>
+        <w:numPr>
+          <w:ilvl w:val="0"/>
+          <w:numId w:val="4"/>
+        </w:numPr>
+        <w:spacing w:line="256" w:lineRule="auto"/>
+        <w:rPr>
+          <w:sz w:val="24"/>
+          <w:szCs w:val="24"/>
+          <w:lang w:val="en-US"/>
+        </w:rPr>
+      </w:pPr>
+      <w:r>
+        <w:rPr>
+          <w:sz w:val="24"/>
+          <w:szCs w:val="24"/>
+          <w:lang w:val="en-US"/>
+        </w:rPr>
+        <w:t xml:space="preserve">Open </w:t>
+      </w:r>
+      <w:hyperlink r:id="rId31" w:history="1">
+        <w:r>
+          <w:rPr>
+            <w:rStyle w:val="Hyperlink"/>
+            <w:sz w:val="24"/>
+            <w:szCs w:val="24"/>
+            <w:lang w:val="en-US"/>
+          </w:rPr>
+          <w:t>https://www.fitpeo.com/revenue-calculator</w:t>
+        </w:r>
+      </w:hyperlink>
+    </w:p>
+    <w:p>
+      <w:pPr>
+        <w:pStyle w:val="ListParagraph"/>
+        <w:numPr>
+          <w:ilvl w:val="1"/>
+          <w:numId w:val="4"/>
+        </w:numPr>
+        <w:spacing w:line="256" w:lineRule="auto"/>
+        <w:rPr>
+          <w:sz w:val="24"/>
+          <w:szCs w:val="24"/>
+          <w:lang w:val="en-US"/>
+        </w:rPr>
+      </w:pPr>
+      <w:r>
+        <w:rPr>
+          <w:sz w:val="24"/>
+          <w:szCs w:val="24"/>
+          <w:lang w:val="en-US"/>
+        </w:rPr>
+        <w:t xml:space="preserve">Try entering 600 in the text box. </w:t>
+      </w:r>
+    </w:p>
+    <w:p>
+      <w:pPr>
+        <w:pStyle w:val="ListParagraph"/>
+        <w:numPr>
+          <w:ilvl w:val="0"/>
+          <w:numId w:val="4"/>
+        </w:numPr>
+        <w:spacing w:line="256" w:lineRule="auto"/>
+        <w:rPr>
+          <w:sz w:val="24"/>
+          <w:szCs w:val="24"/>
+          <w:lang w:val="en-US"/>
+        </w:rPr>
+      </w:pPr>
+      <w:r>
+        <w:rPr>
+          <w:sz w:val="24"/>
+          <w:szCs w:val="24"/>
+          <w:lang w:val="en-US"/>
+        </w:rPr>
+        <w:t xml:space="preserve">Open </w:t>
+      </w:r>
+      <w:hyperlink r:id="rId32" w:history="1">
+        <w:r>
+          <w:rPr>
+            <w:rStyle w:val="Hyperlink"/>
+            <w:sz w:val="24"/>
+            <w:szCs w:val="24"/>
+            <w:lang w:val="en-US"/>
+          </w:rPr>
+          <w:t>https://www.irctc.co.in/nget/profile/user-registration</w:t>
+        </w:r>
+      </w:hyperlink>
+    </w:p>
+    <w:p>
+      <w:pPr>
+        <w:pStyle w:val="ListParagraph"/>
+        <w:numPr>
+          <w:ilvl w:val="1"/>
+          <w:numId w:val="4"/>
+        </w:numPr>
+        <w:spacing w:line="256" w:lineRule="auto"/>
+        <w:rPr>
+          <w:sz w:val="24"/>
+          <w:szCs w:val="24"/>
+          <w:lang w:val="en-US"/>
+        </w:rPr>
+      </w:pPr>
+      <w:r>
+        <w:rPr>
+          <w:sz w:val="24"/>
+          <w:szCs w:val="24"/>
+          <w:lang w:val="en-US"/>
+        </w:rPr>
+        <w:t>Complete the registration process.</w:t>
+      </w:r>
+    </w:p>
+    <w:p>
+      <w:pPr>
+        <w:pStyle w:val="ListParagraph"/>
+        <w:numPr>
+          <w:ilvl w:val="1"/>
+          <w:numId w:val="4"/>
+        </w:numPr>
+        <w:spacing w:line="256" w:lineRule="auto"/>
+        <w:rPr>
+          <w:sz w:val="24"/>
+          <w:szCs w:val="24"/>
+          <w:lang w:val="en-US"/>
+        </w:rPr>
+      </w:pPr>
+      <w:r>
+        <w:rPr>
+          <w:sz w:val="24"/>
+          <w:szCs w:val="24"/>
+          <w:lang w:val="en-US"/>
+        </w:rPr>
+        <w:t>Display the messages after clicking on Submit button.</w:t>
+      </w:r>
+    </w:p>
+    <w:p>
+      <w:pPr>
+        <w:pStyle w:val="ListParagraph"/>
+        <w:numPr>
+          <w:ilvl w:val="0"/>
+          <w:numId w:val="4"/>
+        </w:numPr>
+        <w:spacing w:line="256" w:lineRule="auto"/>
+        <w:rPr>
+          <w:sz w:val="24"/>
+          <w:szCs w:val="24"/>
+          <w:lang w:val="en-US"/>
+        </w:rPr>
+      </w:pPr>
+      <w:r>
+        <w:rPr>
+          <w:sz w:val="24"/>
+          <w:szCs w:val="24"/>
+          <w:lang w:val="en-US"/>
+        </w:rPr>
+        <w:lastRenderedPageBreak/>
+        <w:t xml:space="preserve">Open </w:t>
+      </w:r>
+      <w:hyperlink r:id="rId33" w:history="1">
+        <w:r>
+          <w:rPr>
+            <w:rStyle w:val="Hyperlink"/>
+            <w:sz w:val="24"/>
+            <w:szCs w:val="24"/>
+            <w:lang w:val="en-US"/>
+          </w:rPr>
+          <w:t>https://asana.com/</w:t>
+        </w:r>
+      </w:hyperlink>
+    </w:p>
+    <w:p>
+      <w:pPr>
+        <w:pStyle w:val="ListParagraph"/>
+        <w:numPr>
+          <w:ilvl w:val="1"/>
+          <w:numId w:val="4"/>
+        </w:numPr>
+        <w:spacing w:line="256" w:lineRule="auto"/>
+        <w:rPr>
+          <w:sz w:val="24"/>
+          <w:szCs w:val="24"/>
+          <w:lang w:val="en-US"/>
+        </w:rPr>
+      </w:pPr>
+      <w:r>
+        <w:rPr>
+          <w:sz w:val="24"/>
+          <w:szCs w:val="24"/>
+          <w:lang w:val="en-US"/>
+        </w:rPr>
+        <w:t>Click on login button</w:t>
+      </w:r>
+    </w:p>
+    <w:p>
+      <w:pPr>
+        <w:pStyle w:val="ListParagraph"/>
+        <w:numPr>
+          <w:ilvl w:val="0"/>
+          <w:numId w:val="4"/>
+        </w:numPr>
+        <w:spacing w:line="256" w:lineRule="auto"/>
+        <w:rPr>
+          <w:sz w:val="24"/>
+          <w:szCs w:val="24"/>
+          <w:lang w:val="en-US"/>
+        </w:rPr>
+      </w:pPr>
+      <w:r>
+        <w:rPr>
+          <w:sz w:val="24"/>
+          <w:szCs w:val="24"/>
+          <w:lang w:val="en-US"/>
+        </w:rPr>
+        <w:t xml:space="preserve">Open </w:t>
+      </w:r>
+      <w:hyperlink r:id="rId34" w:history="1">
+        <w:r>
+          <w:rPr>
+            <w:rStyle w:val="Hyperlink"/>
+            <w:sz w:val="24"/>
+            <w:szCs w:val="24"/>
+            <w:lang w:val="en-US"/>
+          </w:rPr>
+          <w:t>https://www.jotform.com/form-templates/exam-registration-form</w:t>
+        </w:r>
+      </w:hyperlink>
+    </w:p>
+    <w:p>
+      <w:pPr>
+        <w:pStyle w:val="ListParagraph"/>
+        <w:numPr>
+          <w:ilvl w:val="1"/>
+          <w:numId w:val="4"/>
+        </w:numPr>
+        <w:spacing w:line="256" w:lineRule="auto"/>
+        <w:rPr>
+          <w:sz w:val="24"/>
+          <w:szCs w:val="24"/>
+          <w:lang w:val="en-US"/>
+        </w:rPr>
+      </w:pPr>
+      <w:r>
+        <w:rPr>
+          <w:sz w:val="24"/>
+          <w:szCs w:val="24"/>
+          <w:lang w:val="en-US"/>
+        </w:rPr>
+        <w:t>Complete the registration process</w:t>
+      </w:r>
+    </w:p>
+    <w:p>
+      <w:pPr>
+        <w:pStyle w:val="ListParagraph"/>
+        <w:numPr>
+          <w:ilvl w:val="0"/>
+          <w:numId w:val="4"/>
+        </w:numPr>
+        <w:spacing w:line="254" w:lineRule="auto"/>
+        <w:rPr>
+          <w:sz w:val="24"/>
+          <w:szCs w:val="24"/>
+          <w:lang w:val="en-US"/>
+        </w:rPr>
+      </w:pPr>
+      <w:r>
+        <w:rPr>
+          <w:sz w:val="24"/>
+          <w:szCs w:val="24"/>
+          <w:lang w:val="en-US"/>
+        </w:rPr>
+        <w:t xml:space="preserve">Open </w:t>
+      </w:r>
+      <w:hyperlink r:id="rId35" w:history="1">
+        <w:r>
+          <w:rPr>
+            <w:rStyle w:val="Hyperlink"/>
+            <w:sz w:val="24"/>
+            <w:szCs w:val="24"/>
+            <w:lang w:val="en-US"/>
+          </w:rPr>
+          <w:t>https://www.nimblework.com/resources/?tx_post_tag=case-studies</w:t>
+        </w:r>
+      </w:hyperlink>
+      <w:r>
+        <w:rPr>
+          <w:sz w:val="24"/>
+          <w:szCs w:val="24"/>
+          <w:lang w:val="en-US"/>
+        </w:rPr>
+        <w:t xml:space="preserve"> </w:t>
+      </w:r>
+    </w:p>
+    <w:p>
+      <w:pPr>
+        <w:pStyle w:val="ListParagraph"/>
+        <w:numPr>
+          <w:ilvl w:val="1"/>
+          <w:numId w:val="4"/>
+        </w:numPr>
+        <w:spacing w:line="254" w:lineRule="auto"/>
+        <w:rPr>
+          <w:sz w:val="24"/>
+          <w:szCs w:val="24"/>
+          <w:lang w:val="en-US"/>
+        </w:rPr>
+      </w:pPr>
+      <w:r>
+        <w:rPr>
+          <w:sz w:val="24"/>
+          <w:szCs w:val="24"/>
+          <w:lang w:val="en-US"/>
+        </w:rPr>
+        <w:t>Click on The image of chat</w:t>
+      </w:r>
+    </w:p>
+    <w:p>
+      <w:pPr>
+        <w:pStyle w:val="ListParagraph"/>
+        <w:numPr>
+          <w:ilvl w:val="1"/>
+          <w:numId w:val="4"/>
+        </w:numPr>
+        <w:spacing w:line="254" w:lineRule="auto"/>
+        <w:rPr>
+          <w:sz w:val="24"/>
+          <w:szCs w:val="24"/>
+          <w:lang w:val="en-US"/>
+        </w:rPr>
+      </w:pPr>
+      <w:r>
+        <w:rPr>
+          <w:sz w:val="24"/>
+          <w:szCs w:val="24"/>
+          <w:lang w:val="en-US"/>
+        </w:rPr>
+        <w:t>Type Hello in the chat text box</w:t>
+      </w:r>
+    </w:p>
+    <w:p>
+      <w:pPr>
+        <w:pStyle w:val="ListParagraph"/>
+        <w:numPr>
+          <w:ilvl w:val="1"/>
+          <w:numId w:val="4"/>
+        </w:numPr>
+        <w:rPr>
+          <w:sz w:val="26"/>
+          <w:szCs w:val="24"/>
+          <w:lang w:val="en-US"/>
+        </w:rPr>
+      </w:pPr>
+      <w:r>
+        <w:rPr>
+          <w:sz w:val="24"/>
+          <w:szCs w:val="24"/>
+          <w:lang w:val="en-US"/>
+        </w:rPr>
+        <w:t>Hit Enter</w:t>
+      </w:r>
+    </w:p>
+    <w:p>
+      <w:pPr>
+        <w:pStyle w:val="ListParagraph"/>
+        <w:numPr>
+          <w:ilvl w:val="1"/>
+          <w:numId w:val="4"/>
+        </w:numPr>
+        <w:rPr>
+          <w:sz w:val="24"/>
+          <w:szCs w:val="24"/>
+          <w:lang w:val="en-US"/>
+        </w:rPr>
+      </w:pPr>
       <w:bookmarkStart w:id="0" w:name="_GoBack"/>
       <w:bookmarkEnd w:id="0"/>
     </w:p>
@@ -4360,7 +5047,34 @@
           <w:lang w:val="en-US"/>
         </w:rPr>
       </w:pPr>
-      <w:hyperlink r:id="rId30" w:history="1">
+    </w:p>
+    <w:p>
+      <w:pPr>
+        <w:rPr>
+          <w:lang w:val="en-US"/>
+        </w:rPr>
+      </w:pPr>
+    </w:p>
+    <w:p>
+      <w:pPr>
+        <w:rPr>
+          <w:lang w:val="en-US"/>
+        </w:rPr>
+      </w:pPr>
+      <w:r>
+        <w:rPr>
+          <w:lang w:val="en-US"/>
+        </w:rPr>
+        <w:t>Project Discussion</w:t>
+      </w:r>
+    </w:p>
+    <w:p>
+      <w:pPr>
+        <w:rPr>
+          <w:lang w:val="en-US"/>
+        </w:rPr>
+      </w:pPr>
+      <w:hyperlink r:id="rId36" w:history="1">
         <w:r>
           <w:rPr>
             <w:rStyle w:val="Hyperlink"/>

</xml_diff>

<commit_message>
Date: 15 Sept 2025
</commit_message>
<xml_diff>
--- a/Assignments.docx
+++ b/Assignments.docx
@@ -62,91 +62,29 @@
           <w:lang w:val="en-US"/>
         </w:rPr>
         <w:br/>
-      </w:r>
-      <w:proofErr w:type="spellStart"/>
-      <w:r>
-        <w:rPr>
-          <w:lang w:val="en-US"/>
-        </w:rPr>
-        <w:t>hra</w:t>
-      </w:r>
-      <w:proofErr w:type="spellEnd"/>
-      <w:r>
-        <w:rPr>
-          <w:lang w:val="en-US"/>
-        </w:rPr>
-        <w:t xml:space="preserve"> = 20 % of basic salary</w:t>
+        <w:t>hra = 20 % of basic salary</w:t>
       </w:r>
       <w:r>
         <w:rPr>
           <w:lang w:val="en-US"/>
         </w:rPr>
         <w:br/>
-      </w:r>
-      <w:proofErr w:type="spellStart"/>
-      <w:r>
-        <w:rPr>
-          <w:lang w:val="en-US"/>
-        </w:rPr>
-        <w:t>pf</w:t>
-      </w:r>
-      <w:proofErr w:type="spellEnd"/>
-      <w:r>
-        <w:rPr>
-          <w:lang w:val="en-US"/>
-        </w:rPr>
-        <w:t xml:space="preserve"> = 5% of basic salary</w:t>
+        <w:t>pf = 5% of basic salary</w:t>
       </w:r>
       <w:r>
         <w:rPr>
           <w:lang w:val="en-US"/>
         </w:rPr>
         <w:br/>
-        <w:t xml:space="preserve">gross = </w:t>
-      </w:r>
-      <w:proofErr w:type="spellStart"/>
-      <w:r>
-        <w:rPr>
-          <w:lang w:val="en-US"/>
-        </w:rPr>
-        <w:t>basicSalary</w:t>
-      </w:r>
-      <w:proofErr w:type="spellEnd"/>
-      <w:r>
-        <w:rPr>
-          <w:lang w:val="en-US"/>
-        </w:rPr>
-        <w:t xml:space="preserve"> + da + </w:t>
-      </w:r>
-      <w:proofErr w:type="spellStart"/>
-      <w:r>
-        <w:rPr>
-          <w:lang w:val="en-US"/>
-        </w:rPr>
-        <w:t>hra</w:t>
-      </w:r>
-      <w:proofErr w:type="spellEnd"/>
-      <w:r>
-        <w:rPr>
-          <w:lang w:val="en-US"/>
-        </w:rPr>
-        <w:t xml:space="preserve"> </w:t>
+        <w:t xml:space="preserve">gross = basicSalary + da + hra </w:t>
       </w:r>
       <w:r>
         <w:rPr>
           <w:lang w:val="en-US"/>
         </w:rPr>
         <w:br/>
-        <w:t xml:space="preserve">net = gross – </w:t>
-      </w:r>
-      <w:proofErr w:type="spellStart"/>
-      <w:r>
-        <w:rPr>
-          <w:lang w:val="en-US"/>
-        </w:rPr>
-        <w:t>pf</w:t>
-      </w:r>
-      <w:proofErr w:type="spellEnd"/>
+        <w:t>net = gross – pf</w:t>
+      </w:r>
     </w:p>
     <w:p>
       <w:pPr>
@@ -273,23 +211,13 @@
         </w:rPr>
         <w:tab/>
       </w:r>
-      <w:proofErr w:type="spellStart"/>
-      <w:r>
-        <w:rPr>
-          <w:sz w:val="24"/>
-          <w:szCs w:val="24"/>
-          <w:lang w:val="en-US"/>
-        </w:rPr>
-        <w:t>Avg</w:t>
-      </w:r>
-      <w:proofErr w:type="spellEnd"/>
-      <w:r>
-        <w:rPr>
-          <w:sz w:val="24"/>
-          <w:szCs w:val="24"/>
-          <w:lang w:val="en-US"/>
-        </w:rPr>
-        <w:t xml:space="preserve"> Marks</w:t>
+      <w:r>
+        <w:rPr>
+          <w:sz w:val="24"/>
+          <w:szCs w:val="24"/>
+          <w:lang w:val="en-US"/>
+        </w:rPr>
+        <w:t>Avg Marks</w:t>
       </w:r>
       <w:r>
         <w:rPr>
@@ -355,17 +283,8 @@
           <w:lang w:val="en-US"/>
         </w:rPr>
         <w:tab/>
-      </w:r>
-      <w:proofErr w:type="spellStart"/>
-      <w:r>
-        <w:rPr>
-          <w:sz w:val="24"/>
-          <w:szCs w:val="24"/>
-          <w:lang w:val="en-US"/>
-        </w:rPr>
         <w:t>Dist</w:t>
       </w:r>
-      <w:proofErr w:type="spellEnd"/>
       <w:r>
         <w:rPr>
           <w:sz w:val="24"/>
@@ -681,21 +600,7 @@
         <w:rPr>
           <w:lang w:val="en-US"/>
         </w:rPr>
-        <w:t xml:space="preserve">Try </w:t>
-      </w:r>
-      <w:proofErr w:type="gramStart"/>
-      <w:r>
-        <w:rPr>
-          <w:lang w:val="en-US"/>
-        </w:rPr>
-        <w:t>getPageSource(</w:t>
-      </w:r>
-      <w:proofErr w:type="gramEnd"/>
-      <w:r>
-        <w:rPr>
-          <w:lang w:val="en-US"/>
-        </w:rPr>
-        <w:t>) method and tell me what is the purpose and return type of this method.</w:t>
+        <w:t>Try getPageSource() method and tell me what is the purpose and return type of this method.</w:t>
       </w:r>
     </w:p>
     <w:p>
@@ -1165,25 +1070,7 @@
           <w:szCs w:val="24"/>
           <w:lang w:val="en-US"/>
         </w:rPr>
-        <w:t xml:space="preserve">Enter email </w:t>
-      </w:r>
-      <w:proofErr w:type="spellStart"/>
-      <w:r>
-        <w:rPr>
-          <w:sz w:val="26"/>
-          <w:szCs w:val="24"/>
-          <w:lang w:val="en-US"/>
-        </w:rPr>
-        <w:t>as</w:t>
-      </w:r>
-      <w:proofErr w:type="spellEnd"/>
-      <w:r>
-        <w:rPr>
-          <w:sz w:val="26"/>
-          <w:szCs w:val="24"/>
-          <w:lang w:val="en-US"/>
-        </w:rPr>
-        <w:t xml:space="preserve"> </w:t>
+        <w:t xml:space="preserve">Enter email as </w:t>
       </w:r>
       <w:hyperlink r:id="rId10" w:history="1">
         <w:r>
@@ -1311,25 +1198,7 @@
           <w:szCs w:val="24"/>
           <w:lang w:val="en-US"/>
         </w:rPr>
-        <w:t>Enter username as your name (</w:t>
-      </w:r>
-      <w:proofErr w:type="spellStart"/>
-      <w:r>
-        <w:rPr>
-          <w:sz w:val="26"/>
-          <w:szCs w:val="24"/>
-          <w:lang w:val="en-US"/>
-        </w:rPr>
-        <w:t>prajakta</w:t>
-      </w:r>
-      <w:proofErr w:type="spellEnd"/>
-      <w:r>
-        <w:rPr>
-          <w:sz w:val="26"/>
-          <w:szCs w:val="24"/>
-          <w:lang w:val="en-US"/>
-        </w:rPr>
-        <w:t>)</w:t>
+        <w:t>Enter username as your name (prajakta)</w:t>
       </w:r>
     </w:p>
     <w:p>
@@ -1468,25 +1337,7 @@
           <w:szCs w:val="24"/>
           <w:lang w:val="en-US"/>
         </w:rPr>
-        <w:t xml:space="preserve">Enter </w:t>
-      </w:r>
-      <w:proofErr w:type="spellStart"/>
-      <w:r>
-        <w:rPr>
-          <w:sz w:val="26"/>
-          <w:szCs w:val="24"/>
-          <w:lang w:val="en-US"/>
-        </w:rPr>
-        <w:t>rediff</w:t>
-      </w:r>
-      <w:proofErr w:type="spellEnd"/>
-      <w:r>
-        <w:rPr>
-          <w:sz w:val="26"/>
-          <w:szCs w:val="24"/>
-          <w:lang w:val="en-US"/>
-        </w:rPr>
-        <w:t xml:space="preserve"> Id</w:t>
+        <w:t>Enter rediff Id</w:t>
       </w:r>
     </w:p>
     <w:p>
@@ -1670,25 +1521,7 @@
           <w:szCs w:val="24"/>
           <w:lang w:val="en-US"/>
         </w:rPr>
-        <w:t xml:space="preserve">Enter </w:t>
-      </w:r>
-      <w:proofErr w:type="spellStart"/>
-      <w:r>
-        <w:rPr>
-          <w:sz w:val="26"/>
-          <w:szCs w:val="24"/>
-          <w:lang w:val="en-US"/>
-        </w:rPr>
-        <w:t>rediff</w:t>
-      </w:r>
-      <w:proofErr w:type="spellEnd"/>
-      <w:r>
-        <w:rPr>
-          <w:sz w:val="26"/>
-          <w:szCs w:val="24"/>
-          <w:lang w:val="en-US"/>
-        </w:rPr>
-        <w:t xml:space="preserve"> Id</w:t>
+        <w:t>Enter rediff Id</w:t>
       </w:r>
     </w:p>
     <w:p>
@@ -1849,25 +1682,7 @@
           <w:szCs w:val="24"/>
           <w:lang w:val="en-US"/>
         </w:rPr>
-        <w:t>Enter username as your name (</w:t>
-      </w:r>
-      <w:proofErr w:type="spellStart"/>
-      <w:r>
-        <w:rPr>
-          <w:sz w:val="26"/>
-          <w:szCs w:val="24"/>
-          <w:lang w:val="en-US"/>
-        </w:rPr>
-        <w:t>prajakta</w:t>
-      </w:r>
-      <w:proofErr w:type="spellEnd"/>
-      <w:r>
-        <w:rPr>
-          <w:sz w:val="26"/>
-          <w:szCs w:val="24"/>
-          <w:lang w:val="en-US"/>
-        </w:rPr>
-        <w:t>)</w:t>
+        <w:t>Enter username as your name (prajakta)</w:t>
       </w:r>
     </w:p>
     <w:p>
@@ -1969,21 +1784,7 @@
         <w:rPr>
           <w:lang w:val="en-US"/>
         </w:rPr>
-        <w:t xml:space="preserve">Complete </w:t>
-      </w:r>
-      <w:proofErr w:type="spellStart"/>
-      <w:r>
-        <w:rPr>
-          <w:lang w:val="en-US"/>
-        </w:rPr>
-        <w:t>facebook</w:t>
-      </w:r>
-      <w:proofErr w:type="spellEnd"/>
-      <w:r>
-        <w:rPr>
-          <w:lang w:val="en-US"/>
-        </w:rPr>
-        <w:t xml:space="preserve"> login via relative locator</w:t>
+        <w:t>Complete facebook login via relative locator</w:t>
       </w:r>
       <w:r>
         <w:rPr>
@@ -2449,25 +2250,7 @@
           <w:szCs w:val="24"/>
           <w:lang w:val="en-US"/>
         </w:rPr>
-        <w:t xml:space="preserve">Enter first 4 characters from your city (Kolhapur – </w:t>
-      </w:r>
-      <w:proofErr w:type="spellStart"/>
-      <w:r>
-        <w:rPr>
-          <w:sz w:val="24"/>
-          <w:szCs w:val="24"/>
-          <w:lang w:val="en-US"/>
-        </w:rPr>
-        <w:t>kolh</w:t>
-      </w:r>
-      <w:proofErr w:type="spellEnd"/>
-      <w:r>
-        <w:rPr>
-          <w:sz w:val="24"/>
-          <w:szCs w:val="24"/>
-          <w:lang w:val="en-US"/>
-        </w:rPr>
-        <w:t>)</w:t>
+        <w:t>Enter first 4 characters from your city (Kolhapur – kolh)</w:t>
       </w:r>
     </w:p>
     <w:p>
@@ -3762,25 +3545,7 @@
           <w:szCs w:val="24"/>
           <w:lang w:val="en-US"/>
         </w:rPr>
-        <w:t xml:space="preserve">Click on </w:t>
-      </w:r>
-      <w:proofErr w:type="spellStart"/>
-      <w:r>
-        <w:rPr>
-          <w:sz w:val="24"/>
-          <w:szCs w:val="24"/>
-          <w:lang w:val="en-US"/>
-        </w:rPr>
-        <w:t>ClickToGetAlert</w:t>
-      </w:r>
-      <w:proofErr w:type="spellEnd"/>
-      <w:r>
-        <w:rPr>
-          <w:sz w:val="24"/>
-          <w:szCs w:val="24"/>
-          <w:lang w:val="en-US"/>
-        </w:rPr>
-        <w:t xml:space="preserve"> button</w:t>
+        <w:t>Click on ClickToGetAlert button</w:t>
       </w:r>
     </w:p>
     <w:p>
@@ -3849,25 +3614,7 @@
           <w:szCs w:val="24"/>
           <w:lang w:val="en-US"/>
         </w:rPr>
-        <w:t xml:space="preserve">Click on </w:t>
-      </w:r>
-      <w:proofErr w:type="spellStart"/>
-      <w:r>
-        <w:rPr>
-          <w:sz w:val="24"/>
-          <w:szCs w:val="24"/>
-          <w:lang w:val="en-US"/>
-        </w:rPr>
-        <w:t>GetPrompt</w:t>
-      </w:r>
-      <w:proofErr w:type="spellEnd"/>
-      <w:r>
-        <w:rPr>
-          <w:sz w:val="24"/>
-          <w:szCs w:val="24"/>
-          <w:lang w:val="en-US"/>
-        </w:rPr>
-        <w:t xml:space="preserve"> Button</w:t>
+        <w:t>Click on GetPrompt Button</w:t>
       </w:r>
     </w:p>
     <w:p>
@@ -3936,25 +3683,7 @@
           <w:szCs w:val="24"/>
           <w:lang w:val="en-US"/>
         </w:rPr>
-        <w:t xml:space="preserve">Click on </w:t>
-      </w:r>
-      <w:proofErr w:type="spellStart"/>
-      <w:r>
-        <w:rPr>
-          <w:sz w:val="24"/>
-          <w:szCs w:val="24"/>
-          <w:lang w:val="en-US"/>
-        </w:rPr>
-        <w:t>GetConfirmation</w:t>
-      </w:r>
-      <w:proofErr w:type="spellEnd"/>
-      <w:r>
-        <w:rPr>
-          <w:sz w:val="24"/>
-          <w:szCs w:val="24"/>
-          <w:lang w:val="en-US"/>
-        </w:rPr>
-        <w:t xml:space="preserve"> Button </w:t>
+        <w:t xml:space="preserve">Click on GetConfirmation Button </w:t>
       </w:r>
     </w:p>
     <w:p>
@@ -4309,18 +4038,8 @@
           <w:szCs w:val="24"/>
           <w:lang w:val="en-US"/>
         </w:rPr>
-        <w:t xml:space="preserve">Login using data provided in step no h &amp; </w:t>
-      </w:r>
-      <w:proofErr w:type="spellStart"/>
-      <w:r>
-        <w:rPr>
-          <w:sz w:val="24"/>
-          <w:szCs w:val="24"/>
-          <w:lang w:val="en-US"/>
-        </w:rPr>
-        <w:t>i</w:t>
-      </w:r>
-      <w:proofErr w:type="spellEnd"/>
+        <w:t>Login using data provided in step no h &amp; i</w:t>
+      </w:r>
     </w:p>
     <w:p>
       <w:pPr>
@@ -5038,8 +4757,6 @@
           <w:lang w:val="en-US"/>
         </w:rPr>
       </w:pPr>
-      <w:bookmarkStart w:id="0" w:name="_GoBack"/>
-      <w:bookmarkEnd w:id="0"/>
     </w:p>
     <w:p>
       <w:pPr>
@@ -5090,6 +4807,403 @@
           <w:lang w:val="en-US"/>
         </w:rPr>
       </w:pPr>
+    </w:p>
+    <w:p>
+      <w:pPr>
+        <w:rPr>
+          <w:b/>
+          <w:bCs/>
+          <w:lang w:val="en-US"/>
+        </w:rPr>
+      </w:pPr>
+      <w:r>
+        <w:rPr>
+          <w:b/>
+          <w:bCs/>
+          <w:lang w:val="en-US"/>
+        </w:rPr>
+        <w:t>TestNG Assignment</w:t>
+      </w:r>
+    </w:p>
+    <w:p>
+      <w:pPr>
+        <w:pStyle w:val="ListParagraph"/>
+        <w:numPr>
+          <w:ilvl w:val="0"/>
+          <w:numId w:val="6"/>
+        </w:numPr>
+        <w:rPr>
+          <w:lang w:val="en-US"/>
+        </w:rPr>
+      </w:pPr>
+      <w:r>
+        <w:rPr>
+          <w:lang w:val="en-US"/>
+        </w:rPr>
+        <w:t>Launch Google</w:t>
+      </w:r>
+    </w:p>
+    <w:p>
+      <w:pPr>
+        <w:pStyle w:val="ListParagraph"/>
+        <w:numPr>
+          <w:ilvl w:val="0"/>
+          <w:numId w:val="6"/>
+        </w:numPr>
+        <w:rPr>
+          <w:lang w:val="en-US"/>
+        </w:rPr>
+      </w:pPr>
+      <w:r>
+        <w:rPr>
+          <w:lang w:val="en-US"/>
+        </w:rPr>
+        <w:t>Print Title</w:t>
+      </w:r>
+    </w:p>
+    <w:p>
+      <w:pPr>
+        <w:pStyle w:val="ListParagraph"/>
+        <w:numPr>
+          <w:ilvl w:val="0"/>
+          <w:numId w:val="6"/>
+        </w:numPr>
+        <w:rPr>
+          <w:b/>
+          <w:bCs/>
+          <w:lang w:val="en-US"/>
+        </w:rPr>
+      </w:pPr>
+      <w:r>
+        <w:rPr>
+          <w:b/>
+          <w:bCs/>
+          <w:lang w:val="en-US"/>
+        </w:rPr>
+        <w:t>Click on Gmail</w:t>
+      </w:r>
+    </w:p>
+    <w:p>
+      <w:pPr>
+        <w:pStyle w:val="ListParagraph"/>
+        <w:numPr>
+          <w:ilvl w:val="0"/>
+          <w:numId w:val="6"/>
+        </w:numPr>
+        <w:rPr>
+          <w:lang w:val="en-US"/>
+        </w:rPr>
+      </w:pPr>
+      <w:r>
+        <w:rPr>
+          <w:lang w:val="en-US"/>
+        </w:rPr>
+        <w:t>Print Title</w:t>
+      </w:r>
+      <w:r>
+        <w:rPr>
+          <w:lang w:val="en-US"/>
+        </w:rPr>
+        <w:br/>
+      </w:r>
+    </w:p>
+    <w:p>
+      <w:pPr>
+        <w:pStyle w:val="ListParagraph"/>
+        <w:numPr>
+          <w:ilvl w:val="0"/>
+          <w:numId w:val="6"/>
+        </w:numPr>
+        <w:rPr>
+          <w:lang w:val="en-US"/>
+        </w:rPr>
+      </w:pPr>
+      <w:r>
+        <w:rPr>
+          <w:lang w:val="en-US"/>
+        </w:rPr>
+        <w:t>Launch Google</w:t>
+      </w:r>
+    </w:p>
+    <w:p>
+      <w:pPr>
+        <w:pStyle w:val="ListParagraph"/>
+        <w:numPr>
+          <w:ilvl w:val="0"/>
+          <w:numId w:val="6"/>
+        </w:numPr>
+        <w:rPr>
+          <w:lang w:val="en-US"/>
+        </w:rPr>
+      </w:pPr>
+      <w:r>
+        <w:rPr>
+          <w:lang w:val="en-US"/>
+        </w:rPr>
+        <w:t>Print Title</w:t>
+      </w:r>
+    </w:p>
+    <w:p>
+      <w:pPr>
+        <w:pStyle w:val="ListParagraph"/>
+        <w:numPr>
+          <w:ilvl w:val="0"/>
+          <w:numId w:val="6"/>
+        </w:numPr>
+        <w:rPr>
+          <w:b/>
+          <w:bCs/>
+          <w:lang w:val="en-US"/>
+        </w:rPr>
+      </w:pPr>
+      <w:r>
+        <w:rPr>
+          <w:b/>
+          <w:bCs/>
+          <w:lang w:val="en-US"/>
+        </w:rPr>
+        <w:t>Click on Images</w:t>
+      </w:r>
+    </w:p>
+    <w:p>
+      <w:pPr>
+        <w:pStyle w:val="ListParagraph"/>
+        <w:numPr>
+          <w:ilvl w:val="0"/>
+          <w:numId w:val="6"/>
+        </w:numPr>
+        <w:rPr>
+          <w:lang w:val="en-US"/>
+        </w:rPr>
+      </w:pPr>
+      <w:r>
+        <w:rPr>
+          <w:lang w:val="en-US"/>
+        </w:rPr>
+        <w:t>Print Title</w:t>
+      </w:r>
+      <w:r>
+        <w:rPr>
+          <w:lang w:val="en-US"/>
+        </w:rPr>
+        <w:br/>
+      </w:r>
+    </w:p>
+    <w:p>
+      <w:pPr>
+        <w:pStyle w:val="ListParagraph"/>
+        <w:numPr>
+          <w:ilvl w:val="0"/>
+          <w:numId w:val="6"/>
+        </w:numPr>
+        <w:rPr>
+          <w:lang w:val="en-US"/>
+        </w:rPr>
+      </w:pPr>
+      <w:r>
+        <w:rPr>
+          <w:lang w:val="en-US"/>
+        </w:rPr>
+        <w:t>Launch Google</w:t>
+      </w:r>
+    </w:p>
+    <w:p>
+      <w:pPr>
+        <w:pStyle w:val="ListParagraph"/>
+        <w:numPr>
+          <w:ilvl w:val="0"/>
+          <w:numId w:val="6"/>
+        </w:numPr>
+        <w:rPr>
+          <w:lang w:val="en-US"/>
+        </w:rPr>
+      </w:pPr>
+      <w:r>
+        <w:rPr>
+          <w:lang w:val="en-US"/>
+        </w:rPr>
+        <w:t>Print Title</w:t>
+      </w:r>
+    </w:p>
+    <w:p>
+      <w:pPr>
+        <w:pStyle w:val="ListParagraph"/>
+        <w:numPr>
+          <w:ilvl w:val="0"/>
+          <w:numId w:val="6"/>
+        </w:numPr>
+        <w:rPr>
+          <w:b/>
+          <w:bCs/>
+          <w:lang w:val="en-US"/>
+        </w:rPr>
+      </w:pPr>
+      <w:r>
+        <w:rPr>
+          <w:b/>
+          <w:bCs/>
+          <w:lang w:val="en-US"/>
+        </w:rPr>
+        <w:t xml:space="preserve">Click on </w:t>
+      </w:r>
+      <w:r>
+        <w:rPr>
+          <w:b/>
+          <w:bCs/>
+          <w:lang w:val="en-US"/>
+        </w:rPr>
+        <w:t>Advt</w:t>
+      </w:r>
+    </w:p>
+    <w:p>
+      <w:pPr>
+        <w:pStyle w:val="ListParagraph"/>
+        <w:numPr>
+          <w:ilvl w:val="0"/>
+          <w:numId w:val="6"/>
+        </w:numPr>
+        <w:rPr>
+          <w:lang w:val="en-US"/>
+        </w:rPr>
+      </w:pPr>
+      <w:r>
+        <w:rPr>
+          <w:lang w:val="en-US"/>
+        </w:rPr>
+        <w:t>Print Title</w:t>
+      </w:r>
+      <w:r>
+        <w:rPr>
+          <w:lang w:val="en-US"/>
+        </w:rPr>
+        <w:br/>
+      </w:r>
+    </w:p>
+    <w:p>
+      <w:pPr>
+        <w:pStyle w:val="ListParagraph"/>
+        <w:numPr>
+          <w:ilvl w:val="0"/>
+          <w:numId w:val="6"/>
+        </w:numPr>
+        <w:rPr>
+          <w:lang w:val="en-US"/>
+        </w:rPr>
+      </w:pPr>
+      <w:r>
+        <w:rPr>
+          <w:lang w:val="en-US"/>
+        </w:rPr>
+        <w:t>Launch Google</w:t>
+      </w:r>
+    </w:p>
+    <w:p>
+      <w:pPr>
+        <w:pStyle w:val="ListParagraph"/>
+        <w:numPr>
+          <w:ilvl w:val="0"/>
+          <w:numId w:val="6"/>
+        </w:numPr>
+        <w:rPr>
+          <w:lang w:val="en-US"/>
+        </w:rPr>
+      </w:pPr>
+      <w:r>
+        <w:rPr>
+          <w:lang w:val="en-US"/>
+        </w:rPr>
+        <w:t>Print Title</w:t>
+      </w:r>
+    </w:p>
+    <w:p>
+      <w:pPr>
+        <w:pStyle w:val="ListParagraph"/>
+        <w:numPr>
+          <w:ilvl w:val="0"/>
+          <w:numId w:val="6"/>
+        </w:numPr>
+        <w:rPr>
+          <w:b/>
+          <w:bCs/>
+          <w:lang w:val="en-US"/>
+        </w:rPr>
+      </w:pPr>
+      <w:r>
+        <w:rPr>
+          <w:b/>
+          <w:bCs/>
+          <w:lang w:val="en-US"/>
+        </w:rPr>
+        <w:t xml:space="preserve">Click on </w:t>
+      </w:r>
+      <w:r>
+        <w:rPr>
+          <w:b/>
+          <w:bCs/>
+          <w:lang w:val="en-US"/>
+        </w:rPr>
+        <w:t>About</w:t>
+      </w:r>
+    </w:p>
+    <w:p>
+      <w:pPr>
+        <w:pStyle w:val="ListParagraph"/>
+        <w:numPr>
+          <w:ilvl w:val="0"/>
+          <w:numId w:val="6"/>
+        </w:numPr>
+        <w:rPr>
+          <w:lang w:val="en-US"/>
+        </w:rPr>
+      </w:pPr>
+      <w:r>
+        <w:rPr>
+          <w:lang w:val="en-US"/>
+        </w:rPr>
+        <w:t>Print Title</w:t>
+      </w:r>
+    </w:p>
+    <w:p>
+      <w:pPr>
+        <w:rPr>
+          <w:lang w:val="en-US"/>
+        </w:rPr>
+      </w:pPr>
+    </w:p>
+    <w:p>
+      <w:pPr>
+        <w:rPr>
+          <w:lang w:val="en-US"/>
+        </w:rPr>
+      </w:pPr>
+    </w:p>
+    <w:p>
+      <w:pPr>
+        <w:rPr>
+          <w:lang w:val="en-US"/>
+        </w:rPr>
+      </w:pPr>
+      <w:r>
+        <w:rPr>
+          <w:lang w:val="en-US"/>
+        </w:rPr>
+        <w:t>2. Login to Echotrak application with 4 data set. (using @DataProvider)</w:t>
+      </w:r>
+      <w:r>
+        <w:rPr>
+          <w:lang w:val="en-US"/>
+        </w:rPr>
+        <w:t xml:space="preserve"> display the error message as well after every test</w:t>
+      </w:r>
+    </w:p>
+    <w:p>
+      <w:pPr>
+        <w:rPr>
+          <w:lang w:val="en-US"/>
+        </w:rPr>
+      </w:pPr>
+      <w:bookmarkStart w:id="0" w:name="_GoBack"/>
+      <w:bookmarkEnd w:id="0"/>
     </w:p>
     <w:sectPr>
       <w:pgSz w:w="11906" w:h="16838"/>
@@ -5460,6 +5574,92 @@
     </w:lvl>
   </w:abstractNum>
   <w:abstractNum w:abstractNumId="4">
+    <w:nsid w:val="3D872FBC"/>
+    <w:multiLevelType w:val="hybridMultilevel"/>
+    <w:tmpl w:val="D91CC946"/>
+    <w:lvl w:ilvl="0" w:tplc="4009000F">
+      <w:start w:val="1"/>
+      <w:numFmt w:val="decimal"/>
+      <w:lvlText w:val="%1."/>
+      <w:lvlJc w:val="left"/>
+      <w:pPr>
+        <w:ind w:left="720" w:hanging="360"/>
+      </w:pPr>
+    </w:lvl>
+    <w:lvl w:ilvl="1" w:tplc="40090019" w:tentative="1">
+      <w:start w:val="1"/>
+      <w:numFmt w:val="lowerLetter"/>
+      <w:lvlText w:val="%2."/>
+      <w:lvlJc w:val="left"/>
+      <w:pPr>
+        <w:ind w:left="1440" w:hanging="360"/>
+      </w:pPr>
+    </w:lvl>
+    <w:lvl w:ilvl="2" w:tplc="4009001B" w:tentative="1">
+      <w:start w:val="1"/>
+      <w:numFmt w:val="lowerRoman"/>
+      <w:lvlText w:val="%3."/>
+      <w:lvlJc w:val="right"/>
+      <w:pPr>
+        <w:ind w:left="2160" w:hanging="180"/>
+      </w:pPr>
+    </w:lvl>
+    <w:lvl w:ilvl="3" w:tplc="4009000F" w:tentative="1">
+      <w:start w:val="1"/>
+      <w:numFmt w:val="decimal"/>
+      <w:lvlText w:val="%4."/>
+      <w:lvlJc w:val="left"/>
+      <w:pPr>
+        <w:ind w:left="2880" w:hanging="360"/>
+      </w:pPr>
+    </w:lvl>
+    <w:lvl w:ilvl="4" w:tplc="40090019" w:tentative="1">
+      <w:start w:val="1"/>
+      <w:numFmt w:val="lowerLetter"/>
+      <w:lvlText w:val="%5."/>
+      <w:lvlJc w:val="left"/>
+      <w:pPr>
+        <w:ind w:left="3600" w:hanging="360"/>
+      </w:pPr>
+    </w:lvl>
+    <w:lvl w:ilvl="5" w:tplc="4009001B" w:tentative="1">
+      <w:start w:val="1"/>
+      <w:numFmt w:val="lowerRoman"/>
+      <w:lvlText w:val="%6."/>
+      <w:lvlJc w:val="right"/>
+      <w:pPr>
+        <w:ind w:left="4320" w:hanging="180"/>
+      </w:pPr>
+    </w:lvl>
+    <w:lvl w:ilvl="6" w:tplc="4009000F" w:tentative="1">
+      <w:start w:val="1"/>
+      <w:numFmt w:val="decimal"/>
+      <w:lvlText w:val="%7."/>
+      <w:lvlJc w:val="left"/>
+      <w:pPr>
+        <w:ind w:left="5040" w:hanging="360"/>
+      </w:pPr>
+    </w:lvl>
+    <w:lvl w:ilvl="7" w:tplc="40090019" w:tentative="1">
+      <w:start w:val="1"/>
+      <w:numFmt w:val="lowerLetter"/>
+      <w:lvlText w:val="%8."/>
+      <w:lvlJc w:val="left"/>
+      <w:pPr>
+        <w:ind w:left="5760" w:hanging="360"/>
+      </w:pPr>
+    </w:lvl>
+    <w:lvl w:ilvl="8" w:tplc="4009001B" w:tentative="1">
+      <w:start w:val="1"/>
+      <w:numFmt w:val="lowerRoman"/>
+      <w:lvlText w:val="%9."/>
+      <w:lvlJc w:val="right"/>
+      <w:pPr>
+        <w:ind w:left="6480" w:hanging="180"/>
+      </w:pPr>
+    </w:lvl>
+  </w:abstractNum>
+  <w:abstractNum w:abstractNumId="5">
     <w:nsid w:val="73D636EC"/>
     <w:multiLevelType w:val="hybridMultilevel"/>
     <w:tmpl w:val="00CAB3BC"/>
@@ -5555,13 +5755,16 @@
     <w:abstractNumId w:val="3"/>
   </w:num>
   <w:num w:numId="3">
-    <w:abstractNumId w:val="4"/>
+    <w:abstractNumId w:val="5"/>
   </w:num>
   <w:num w:numId="4">
     <w:abstractNumId w:val="2"/>
   </w:num>
   <w:num w:numId="5">
     <w:abstractNumId w:val="1"/>
+  </w:num>
+  <w:num w:numId="6">
+    <w:abstractNumId w:val="4"/>
   </w:num>
 </w:numbering>
 </file>

</xml_diff>